<commit_message>
Update title, add LPA heatmap figure, improve SHAP visualizations
- Rename to "Bowling Alone, Scrolling Together: In-Person Socialization,
  Social Isolation, and Volunteering Across Five Generational Cohorts"
- Add Figure 2: LPA profile heatmap showing indicator means by profile
- Regenerate SHAP 5-panel (2x3 layout with value labels for readability)
- Fix SHAP dependence plot x-axis bug (filter 470 invalid values >6)
- Improve Gen Z vs Boomer SHAP comparison with value annotations
- Fix lpa_vol_rate_profile_gen.png with profile names on x-axis
- Update figure numbering: Fig 2 (heatmap), Fig 3 (gen dist), Fig 4 (SHAP)
- Rebuild DOCX (8,932 words)

Co-Authored-By: Claude Opus 4.6 <noreply@anthropic.com>
</commit_message>
<xml_diff>
--- a/paper/Bowling_Alone_CLEAN.docx
+++ b/paper/Bowling_Alone_CLEAN.docx
@@ -44,7 +44,7 @@
           <w:i w:val="0"/>
           <w:sz w:val="24"/>
         </w:rPr>
-        <w:t>In-Person Socialization as the First Step to Volunteering</w:t>
+        <w:t>In-Person Socialization, Social Isolation, and Volunteering</w:t>
       </w:r>
     </w:p>
     <w:p>
@@ -59,7 +59,7 @@
           <w:i w:val="0"/>
           <w:sz w:val="24"/>
         </w:rPr>
-        <w:t>Across Generational Cohorts</w:t>
+        <w:t>Across Five Generational Cohorts</w:t>
       </w:r>
     </w:p>
     <w:p>
@@ -3013,7 +3013,7 @@
           <w:i w:val="0"/>
           <w:sz w:val="24"/>
         </w:rPr>
-        <w:t>Predicted probability of volunteering by in-person socialization level and generation, from survey-weighted logistic regression (Model 1). Shaded bands represent 95% confidence intervals.</w:t>
+        <w:t>Predicted probability of volunteering by in-person socialization frequency and generation, from survey-weighted logistic regression (Model 1). Shaded bands represent 95% confidence intervals. The steep initial rise illustrates the First Step Effect; Gen Z's flattening beyond moderate socialization illustrates the generational plateau.</w:t>
       </w:r>
     </w:p>
     <w:p>
@@ -3899,7 +3899,7 @@
           <w:i w:val="0"/>
           <w:sz w:val="24"/>
         </w:rPr>
-        <w:t xml:space="preserve">Person-centered analysis tested whether the regression findings hold when individuals are classified by their full pattern of civic behavior rather than by individual predictors. LPA identified six distinct profiles (Table 3). Three anchor the interpretive framework: the </w:t>
+        <w:t xml:space="preserve">Person-centered analysis tested whether the regression findings hold when individuals are classified by their full pattern of civic behavior rather than by individual predictors. LPA identified six distinct profiles (Table 3; Figure 2). Three anchor the interpretive framework: the </w:t>
       </w:r>
       <w:r>
         <w:rPr>
@@ -5397,6 +5397,75 @@
     </w:p>
     <w:p>
       <w:pPr>
+        <w:spacing w:before="120" w:after="0" w:lineRule="auto" w:line="240"/>
+      </w:pPr>
+    </w:p>
+    <w:p>
+      <w:pPr>
+        <w:spacing w:before="0" w:after="80" w:lineRule="auto" w:line="240"/>
+        <w:jc w:val="center"/>
+      </w:pPr>
+      <w:r>
+        <w:drawing>
+          <wp:inline xmlns:a="http://schemas.openxmlformats.org/drawingml/2006/main" xmlns:pic="http://schemas.openxmlformats.org/drawingml/2006/picture">
+            <wp:extent cx="5029200" cy="3017520"/>
+            <wp:docPr id="2" name="Picture 2"/>
+            <wp:cNvGraphicFramePr>
+              <a:graphicFrameLocks noChangeAspect="1"/>
+            </wp:cNvGraphicFramePr>
+            <a:graphic>
+              <a:graphicData uri="http://schemas.openxmlformats.org/drawingml/2006/picture">
+                <pic:pic>
+                  <pic:nvPicPr>
+                    <pic:cNvPr id="0" name="lpa_profile_heatmap.png"/>
+                    <pic:cNvPicPr/>
+                  </pic:nvPicPr>
+                  <pic:blipFill>
+                    <a:blip r:embed="rId10"/>
+                    <a:stretch>
+                      <a:fillRect/>
+                    </a:stretch>
+                  </pic:blipFill>
+                  <pic:spPr>
+                    <a:xfrm>
+                      <a:off x="0" y="0"/>
+                      <a:ext cx="5029200" cy="3017520"/>
+                    </a:xfrm>
+                    <a:prstGeom prst="rect"/>
+                  </pic:spPr>
+                </pic:pic>
+              </a:graphicData>
+            </a:graphic>
+          </wp:inline>
+        </w:drawing>
+      </w:r>
+    </w:p>
+    <w:p>
+      <w:pPr>
+        <w:spacing w:before="80" w:after="240" w:lineRule="auto" w:line="480"/>
+        <w:jc w:val="left"/>
+      </w:pPr>
+      <w:r>
+        <w:rPr>
+          <w:rFonts w:ascii="Times New Roman" w:hAnsi="Times New Roman" w:cs="Times New Roman"/>
+          <w:b w:val="0"/>
+          <w:i/>
+          <w:sz w:val="24"/>
+        </w:rPr>
+        <w:t xml:space="preserve">Figure 2. </w:t>
+      </w:r>
+      <w:r>
+        <w:rPr>
+          <w:rFonts w:ascii="Times New Roman" w:hAnsi="Times New Roman" w:cs="Times New Roman"/>
+          <w:b w:val="0"/>
+          <w:i w:val="0"/>
+          <w:sz w:val="24"/>
+        </w:rPr>
+        <w:t>Civic engagement profile characteristics from latent profile analysis. Cell values represent indicator means on the original scale; darker shading indicates higher relative values within each indicator.</w:t>
+      </w:r>
+    </w:p>
+    <w:p>
+      <w:pPr>
         <w:spacing w:before="0" w:after="0" w:lineRule="auto" w:line="480"/>
         <w:ind w:firstLine="720"/>
         <w:jc w:val="left"/>
@@ -5408,7 +5477,7 @@
           <w:i w:val="0"/>
           <w:sz w:val="24"/>
         </w:rPr>
-        <w:t>The generational distribution across profiles was pronounced (Table 4; Figure 2). Over a third of Gen Z (35.3%) fell into the Isolated Disengaged profile—more than double the Boomer rate (15.3%)—while only 3.7% of Gen Z reached Fully Engaged status (vs. 15.1% of Boomers). Combining the two socially isolated profiles (Isolated Disengaged and Politically Aware Isolated), over half of Gen Z (50.6%) occupied profiles defined by social disconnection. These proportions were essentially unchanged between the pre- and post-COVID periods (Isolated Disengaged: 35.5% vs. 35.2%), providing person-centered corroboration of the regression-based temporal stability finding. The concentration of Gen Z in socially disconnected profiles is striking in absolute terms: more than one in three Gen Z respondents fell into the profile defined by minimal engagement on every civic indicator—a rate suggesting that social disconnection is not a marginal phenomenon among young adults but a dominant pattern.</w:t>
+        <w:t>The generational distribution across profiles was pronounced (Table 4; Figure 3). Over a third of Gen Z (35.3%) fell into the Isolated Disengaged profile—more than double the Boomer rate (15.3%)—while only 3.7% of Gen Z reached Fully Engaged status (vs. 15.1% of Boomers). Combining the two socially isolated profiles (Isolated Disengaged and Politically Aware Isolated), over half of Gen Z (50.6%) occupied profiles defined by social disconnection. These proportions were essentially unchanged between the pre- and post-COVID periods (Isolated Disengaged: 35.5% vs. 35.2%), providing person-centered corroboration of the regression-based temporal stability finding. The concentration of Gen Z in socially disconnected profiles is striking in absolute terms: more than one in three Gen Z respondents fell into the profile defined by minimal engagement on every civic indicator—a rate suggesting that social disconnection is not a marginal phenomenon among young adults but a dominant pattern.</w:t>
       </w:r>
     </w:p>
     <w:p>
@@ -6365,7 +6434,7 @@
         <w:drawing>
           <wp:inline xmlns:a="http://schemas.openxmlformats.org/drawingml/2006/main" xmlns:pic="http://schemas.openxmlformats.org/drawingml/2006/picture">
             <wp:extent cx="5029200" cy="3017520"/>
-            <wp:docPr id="2" name="Picture 2"/>
+            <wp:docPr id="3" name="Picture 3"/>
             <wp:cNvGraphicFramePr>
               <a:graphicFrameLocks noChangeAspect="1"/>
             </wp:cNvGraphicFramePr>
@@ -6377,7 +6446,7 @@
                     <pic:cNvPicPr/>
                   </pic:nvPicPr>
                   <pic:blipFill>
-                    <a:blip r:embed="rId10"/>
+                    <a:blip r:embed="rId11"/>
                     <a:stretch>
                       <a:fillRect/>
                     </a:stretch>
@@ -6408,7 +6477,7 @@
           <w:i/>
           <w:sz w:val="24"/>
         </w:rPr>
-        <w:t xml:space="preserve">Figure 2. </w:t>
+        <w:t xml:space="preserve">Figure 3. </w:t>
       </w:r>
       <w:r>
         <w:rPr>
@@ -6417,7 +6486,7 @@
           <w:i w:val="0"/>
           <w:sz w:val="24"/>
         </w:rPr>
-        <w:t>Generational distribution across six latent civic engagement profiles.</w:t>
+        <w:t>Generational distribution across six latent civic engagement profiles. Gen Z is disproportionately concentrated in the Isolated Disengaged and Politically Aware Isolated profiles.</w:t>
       </w:r>
     </w:p>
     <w:p>
@@ -6448,7 +6517,7 @@
           <w:i w:val="0"/>
           <w:sz w:val="24"/>
         </w:rPr>
-        <w:t>The regression and profile analyses both rely on researcher-specified variable roles. A final analysis asked whether an algorithm with no imposed structure reaches the same conclusion. An XGBoost classifier trained on the full covariate set achieved test-set AUC = .731, comparable to prior survey-based models of volunteering. TreeSHAP decomposition revealed a generation-specific reversal in feature importance (Figure 3): socialization frequency was the single most important predictor of volunteering for Gen Z (mean |SHAP| = 0.467, indicating that socialization shifted the predicted probability by an average of 0.47 on the log-odds scale), whereas education ranked first for every other generation (mean |SHAP| = 0.426–0.472). SHAP dependence plots independently recovered both the First Step Effect—the steepest gradient at the lowest socialization transition—and the Gen Z plateau, confirming that these patterns are not artifacts of the parametric regression specification. The convergence across methods is itself a finding: a flexible machine learning algorithm, given no information about which variables should interact or where thresholds should fall, independently identified the same two patterns discovered through theory-guided regression—the First Step Effect and the Gen Z plateau—strengthening confidence that these patterns reflect genuine features of the data rather than modeling choices.</w:t>
+        <w:t>The regression and profile analyses both rely on researcher-specified variable roles. A final analysis asked whether an algorithm with no imposed structure reaches the same conclusion. An XGBoost classifier trained on the full covariate set achieved test-set AUC = .731, comparable to prior survey-based models of volunteering. TreeSHAP decomposition revealed a generation-specific reversal in feature importance (Figure 4): socialization frequency was the single most important predictor of volunteering for Gen Z (mean |SHAP| = 0.467, indicating that socialization shifted the predicted probability by an average of 0.47 on the log-odds scale), whereas education ranked first for every other generation (mean |SHAP| = 0.426–0.472). SHAP dependence plots independently recovered both the First Step Effect—the steepest gradient at the lowest socialization transition—and the Gen Z plateau, confirming that these patterns are not artifacts of the parametric regression specification. The convergence across methods is itself a finding: a flexible machine learning algorithm, given no information about which variables should interact or where thresholds should fall, independently identified the same two patterns discovered through theory-guided regression—the First Step Effect and the Gen Z plateau—strengthening confidence that these patterns reflect genuine features of the data rather than modeling choices.</w:t>
       </w:r>
     </w:p>
     <w:p>
@@ -6464,8 +6533,8 @@
       <w:r>
         <w:drawing>
           <wp:inline xmlns:a="http://schemas.openxmlformats.org/drawingml/2006/main" xmlns:pic="http://schemas.openxmlformats.org/drawingml/2006/picture">
-            <wp:extent cx="5029200" cy="1591365"/>
-            <wp:docPr id="3" name="Picture 3"/>
+            <wp:extent cx="5029200" cy="3424216"/>
+            <wp:docPr id="4" name="Picture 4"/>
             <wp:cNvGraphicFramePr>
               <a:graphicFrameLocks noChangeAspect="1"/>
             </wp:cNvGraphicFramePr>
@@ -6477,7 +6546,7 @@
                     <pic:cNvPicPr/>
                   </pic:nvPicPr>
                   <pic:blipFill>
-                    <a:blip r:embed="rId11"/>
+                    <a:blip r:embed="rId12"/>
                     <a:stretch>
                       <a:fillRect/>
                     </a:stretch>
@@ -6485,7 +6554,7 @@
                   <pic:spPr>
                     <a:xfrm>
                       <a:off x="0" y="0"/>
-                      <a:ext cx="5029200" cy="1591365"/>
+                      <a:ext cx="5029200" cy="3424216"/>
                     </a:xfrm>
                     <a:prstGeom prst="rect"/>
                   </pic:spPr>
@@ -6508,7 +6577,7 @@
           <w:i/>
           <w:sz w:val="24"/>
         </w:rPr>
-        <w:t xml:space="preserve">Figure 3. </w:t>
+        <w:t xml:space="preserve">Figure 4. </w:t>
       </w:r>
       <w:r>
         <w:rPr>
@@ -6517,7 +6586,7 @@
           <w:i w:val="0"/>
           <w:sz w:val="24"/>
         </w:rPr>
-        <w:t>Feature importance (mean |SHAP|) by generation from gradient boosting model. Socialization frequency ranks first for Gen Z; education ranks first for all other generations.</w:t>
+        <w:t>Feature importance (mean |SHAP|) by generation from gradient boosting model. Socialization frequency ranks as the most important predictor for Gen Z; education ranks first for all other generations.</w:t>
       </w:r>
     </w:p>
     <w:p>
@@ -6732,7 +6801,7 @@
           <w:i w:val="0"/>
           <w:sz w:val="24"/>
         </w:rPr>
-        <w:t>Socialization's dominance for Gen Z was confirmed by a model with no imposed interaction structure. In the gradient boosting analysis, socialization ranked as the single most important predictor of volunteering for Gen Z, outranking education—the top predictor for every older generation (see Figure 3). For older cohorts with established social networks, the traditional civic voluntarism resources of education and employment retain their predictive primacy (Verba et al., 1995). SHAP dependence plots independently recovered both the First Step Effect and the Gen Z plateau, confirming that these patterns are not artifacts of the parametric regression specification. The concave dose–response shape at the lowest socialization transition—not a statistically novel pattern in itself—carries civic implications that have not been previously documented across five generational cohorts.</w:t>
+        <w:t>Socialization's dominance for Gen Z was confirmed by a model with no imposed interaction structure. In the gradient boosting analysis, socialization ranked as the single most important predictor of volunteering for Gen Z, outranking education—the top predictor for every older generation (see Figure 4). For older cohorts with established social networks, the traditional civic voluntarism resources of education and employment retain their predictive primacy (Verba et al., 1995). SHAP dependence plots independently recovered both the First Step Effect and the Gen Z plateau, confirming that these patterns are not artifacts of the parametric regression specification. The concave dose–response shape at the lowest socialization transition—not a statistically novel pattern in itself—carries civic implications that have not been previously documented across five generational cohorts.</w:t>
       </w:r>
     </w:p>
     <w:p>

</xml_diff>

<commit_message>
Remove Table 4 (redundant with Figure 3), add focused SHAP comparison figure
- Delete Table 4 (Generational Distribution Across Profiles) — same data
  as Figure 3 stacked bar chart; keeping figure for visual impact
- Replace Figure 4 with focused socialization vs education SHAP comparison
  showing the predictor importance reversal: Gen Z is the only generation
  where socialization outranks education (0.467 vs 0.426)
- Update all Table 4 references in Results and Discussion to Figure 3
- Final: 3 tables, 4 figures, 8,927 words

Co-Authored-By: Claude Opus 4.6 <noreply@anthropic.com>
</commit_message>
<xml_diff>
--- a/paper/Bowling_Alone_CLEAN.docx
+++ b/paper/Bowling_Alone_CLEAN.docx
@@ -5477,948 +5477,8 @@
           <w:i w:val="0"/>
           <w:sz w:val="24"/>
         </w:rPr>
-        <w:t>The generational distribution across profiles was pronounced (Table 4; Figure 3). Over a third of Gen Z (35.3%) fell into the Isolated Disengaged profile—more than double the Boomer rate (15.3%)—while only 3.7% of Gen Z reached Fully Engaged status (vs. 15.1% of Boomers). Combining the two socially isolated profiles (Isolated Disengaged and Politically Aware Isolated), over half of Gen Z (50.6%) occupied profiles defined by social disconnection. These proportions were essentially unchanged between the pre- and post-COVID periods (Isolated Disengaged: 35.5% vs. 35.2%), providing person-centered corroboration of the regression-based temporal stability finding. The concentration of Gen Z in socially disconnected profiles is striking in absolute terms: more than one in three Gen Z respondents fell into the profile defined by minimal engagement on every civic indicator—a rate suggesting that social disconnection is not a marginal phenomenon among young adults but a dominant pattern.</w:t>
-      </w:r>
-    </w:p>
-    <w:p>
-      <w:pPr>
-        <w:spacing w:before="240" w:after="80" w:lineRule="auto" w:line="480"/>
-        <w:jc w:val="left"/>
-      </w:pPr>
-      <w:r>
-        <w:rPr>
-          <w:rFonts w:ascii="Times New Roman" w:hAnsi="Times New Roman" w:cs="Times New Roman"/>
-          <w:b/>
-          <w:i/>
-          <w:sz w:val="24"/>
-        </w:rPr>
-        <w:t>Table 4</w:t>
-      </w:r>
-      <w:r>
-        <w:rPr>
-          <w:rFonts w:ascii="Times New Roman" w:hAnsi="Times New Roman" w:cs="Times New Roman"/>
-          <w:b w:val="0"/>
-          <w:i/>
-          <w:sz w:val="24"/>
-        </w:rPr>
-        <w:br/>
-        <w:t>Generational Distribution Across Civic Engagement Profiles (%)</w:t>
-      </w:r>
-    </w:p>
-    <w:tbl>
-      <w:tblPr>
-        <w:tblStyle w:val="TableGrid"/>
-        <w:tblW w:type="auto" w:w="0"/>
-        <w:tblLook w:firstColumn="1" w:firstRow="1" w:lastColumn="0" w:lastRow="0" w:noHBand="0" w:noVBand="1" w:val="04A0"/>
-      </w:tblPr>
-      <w:tblGrid>
-        <w:gridCol w:w="1337"/>
-        <w:gridCol w:w="1337"/>
-        <w:gridCol w:w="1337"/>
-        <w:gridCol w:w="1337"/>
-        <w:gridCol w:w="1337"/>
-        <w:gridCol w:w="1337"/>
-        <w:gridCol w:w="1337"/>
-      </w:tblGrid>
-      <w:tr>
-        <w:tc>
-          <w:tcPr>
-            <w:tcW w:type="dxa" w:w="1337"/>
-          </w:tcPr>
-          <w:p>
-            <w:pPr>
-              <w:spacing w:before="0" w:after="0" w:lineRule="auto" w:line="240"/>
-              <w:jc w:val="center"/>
-            </w:pPr>
-            <w:r/>
-            <w:r>
-              <w:rPr>
-                <w:rFonts w:ascii="Times New Roman" w:hAnsi="Times New Roman" w:cs="Times New Roman"/>
-                <w:b/>
-                <w:i w:val="0"/>
-                <w:sz w:val="20"/>
-              </w:rPr>
-              <w:t>Generation</w:t>
-            </w:r>
-          </w:p>
-        </w:tc>
-        <w:tc>
-          <w:tcPr>
-            <w:tcW w:type="dxa" w:w="1337"/>
-          </w:tcPr>
-          <w:p>
-            <w:pPr>
-              <w:spacing w:before="0" w:after="0" w:lineRule="auto" w:line="240"/>
-              <w:jc w:val="center"/>
-            </w:pPr>
-            <w:r/>
-            <w:r>
-              <w:rPr>
-                <w:rFonts w:ascii="Times New Roman" w:hAnsi="Times New Roman" w:cs="Times New Roman"/>
-                <w:b/>
-                <w:i w:val="0"/>
-                <w:sz w:val="20"/>
-              </w:rPr>
-              <w:t>Isolated Disengaged</w:t>
-            </w:r>
-          </w:p>
-        </w:tc>
-        <w:tc>
-          <w:tcPr>
-            <w:tcW w:type="dxa" w:w="1337"/>
-          </w:tcPr>
-          <w:p>
-            <w:pPr>
-              <w:spacing w:before="0" w:after="0" w:lineRule="auto" w:line="240"/>
-              <w:jc w:val="center"/>
-            </w:pPr>
-            <w:r/>
-            <w:r>
-              <w:rPr>
-                <w:rFonts w:ascii="Times New Roman" w:hAnsi="Times New Roman" w:cs="Times New Roman"/>
-                <w:b/>
-                <w:i w:val="0"/>
-                <w:sz w:val="20"/>
-              </w:rPr>
-              <w:t>Politically Aware Isolated</w:t>
-            </w:r>
-          </w:p>
-        </w:tc>
-        <w:tc>
-          <w:tcPr>
-            <w:tcW w:type="dxa" w:w="1337"/>
-          </w:tcPr>
-          <w:p>
-            <w:pPr>
-              <w:spacing w:before="0" w:after="0" w:lineRule="auto" w:line="240"/>
-              <w:jc w:val="center"/>
-            </w:pPr>
-            <w:r/>
-            <w:r>
-              <w:rPr>
-                <w:rFonts w:ascii="Times New Roman" w:hAnsi="Times New Roman" w:cs="Times New Roman"/>
-                <w:b/>
-                <w:i w:val="0"/>
-                <w:sz w:val="20"/>
-              </w:rPr>
-              <w:t>Socially Active Non-Donors</w:t>
-            </w:r>
-          </w:p>
-        </w:tc>
-        <w:tc>
-          <w:tcPr>
-            <w:tcW w:type="dxa" w:w="1337"/>
-          </w:tcPr>
-          <w:p>
-            <w:pPr>
-              <w:spacing w:before="0" w:after="0" w:lineRule="auto" w:line="240"/>
-              <w:jc w:val="center"/>
-            </w:pPr>
-            <w:r/>
-            <w:r>
-              <w:rPr>
-                <w:rFonts w:ascii="Times New Roman" w:hAnsi="Times New Roman" w:cs="Times New Roman"/>
-                <w:b/>
-                <w:i w:val="0"/>
-                <w:sz w:val="20"/>
-              </w:rPr>
-              <w:t>Mainstream Donors</w:t>
-            </w:r>
-          </w:p>
-        </w:tc>
-        <w:tc>
-          <w:tcPr>
-            <w:tcW w:type="dxa" w:w="1337"/>
-          </w:tcPr>
-          <w:p>
-            <w:pPr>
-              <w:spacing w:before="0" w:after="0" w:lineRule="auto" w:line="240"/>
-              <w:jc w:val="center"/>
-            </w:pPr>
-            <w:r/>
-            <w:r>
-              <w:rPr>
-                <w:rFonts w:ascii="Times New Roman" w:hAnsi="Times New Roman" w:cs="Times New Roman"/>
-                <w:b/>
-                <w:i w:val="0"/>
-                <w:sz w:val="20"/>
-              </w:rPr>
-              <w:t>Activist Boycotters</w:t>
-            </w:r>
-          </w:p>
-        </w:tc>
-        <w:tc>
-          <w:tcPr>
-            <w:tcW w:type="dxa" w:w="1337"/>
-          </w:tcPr>
-          <w:p>
-            <w:pPr>
-              <w:spacing w:before="0" w:after="0" w:lineRule="auto" w:line="240"/>
-              <w:jc w:val="center"/>
-            </w:pPr>
-            <w:r/>
-            <w:r>
-              <w:rPr>
-                <w:rFonts w:ascii="Times New Roman" w:hAnsi="Times New Roman" w:cs="Times New Roman"/>
-                <w:b/>
-                <w:i w:val="0"/>
-                <w:sz w:val="20"/>
-              </w:rPr>
-              <w:t>Fully Engaged</w:t>
-            </w:r>
-          </w:p>
-        </w:tc>
-      </w:tr>
-      <w:tr>
-        <w:tc>
-          <w:tcPr>
-            <w:tcW w:type="dxa" w:w="1337"/>
-          </w:tcPr>
-          <w:p>
-            <w:pPr>
-              <w:spacing w:before="0" w:after="0" w:lineRule="auto" w:line="240"/>
-              <w:jc w:val="left"/>
-            </w:pPr>
-            <w:r/>
-            <w:r>
-              <w:rPr>
-                <w:rFonts w:ascii="Times New Roman" w:hAnsi="Times New Roman" w:cs="Times New Roman"/>
-                <w:b w:val="0"/>
-                <w:i w:val="0"/>
-                <w:sz w:val="20"/>
-              </w:rPr>
-              <w:t>Gen Z</w:t>
-            </w:r>
-          </w:p>
-        </w:tc>
-        <w:tc>
-          <w:tcPr>
-            <w:tcW w:type="dxa" w:w="1337"/>
-          </w:tcPr>
-          <w:p>
-            <w:pPr>
-              <w:spacing w:before="0" w:after="0" w:lineRule="auto" w:line="240"/>
-              <w:jc w:val="center"/>
-            </w:pPr>
-            <w:r/>
-            <w:r>
-              <w:rPr>
-                <w:rFonts w:ascii="Times New Roman" w:hAnsi="Times New Roman" w:cs="Times New Roman"/>
-                <w:b w:val="0"/>
-                <w:i w:val="0"/>
-                <w:sz w:val="20"/>
-              </w:rPr>
-              <w:t>35.3</w:t>
-            </w:r>
-          </w:p>
-        </w:tc>
-        <w:tc>
-          <w:tcPr>
-            <w:tcW w:type="dxa" w:w="1337"/>
-          </w:tcPr>
-          <w:p>
-            <w:pPr>
-              <w:spacing w:before="0" w:after="0" w:lineRule="auto" w:line="240"/>
-              <w:jc w:val="center"/>
-            </w:pPr>
-            <w:r/>
-            <w:r>
-              <w:rPr>
-                <w:rFonts w:ascii="Times New Roman" w:hAnsi="Times New Roman" w:cs="Times New Roman"/>
-                <w:b w:val="0"/>
-                <w:i w:val="0"/>
-                <w:sz w:val="20"/>
-              </w:rPr>
-              <w:t>15.3</w:t>
-            </w:r>
-          </w:p>
-        </w:tc>
-        <w:tc>
-          <w:tcPr>
-            <w:tcW w:type="dxa" w:w="1337"/>
-          </w:tcPr>
-          <w:p>
-            <w:pPr>
-              <w:spacing w:before="0" w:after="0" w:lineRule="auto" w:line="240"/>
-              <w:jc w:val="center"/>
-            </w:pPr>
-            <w:r/>
-            <w:r>
-              <w:rPr>
-                <w:rFonts w:ascii="Times New Roman" w:hAnsi="Times New Roman" w:cs="Times New Roman"/>
-                <w:b w:val="0"/>
-                <w:i w:val="0"/>
-                <w:sz w:val="20"/>
-              </w:rPr>
-              <w:t>20.5</w:t>
-            </w:r>
-          </w:p>
-        </w:tc>
-        <w:tc>
-          <w:tcPr>
-            <w:tcW w:type="dxa" w:w="1337"/>
-          </w:tcPr>
-          <w:p>
-            <w:pPr>
-              <w:spacing w:before="0" w:after="0" w:lineRule="auto" w:line="240"/>
-              <w:jc w:val="center"/>
-            </w:pPr>
-            <w:r/>
-            <w:r>
-              <w:rPr>
-                <w:rFonts w:ascii="Times New Roman" w:hAnsi="Times New Roman" w:cs="Times New Roman"/>
-                <w:b w:val="0"/>
-                <w:i w:val="0"/>
-                <w:sz w:val="20"/>
-              </w:rPr>
-              <w:t>16.4</w:t>
-            </w:r>
-          </w:p>
-        </w:tc>
-        <w:tc>
-          <w:tcPr>
-            <w:tcW w:type="dxa" w:w="1337"/>
-          </w:tcPr>
-          <w:p>
-            <w:pPr>
-              <w:spacing w:before="0" w:after="0" w:lineRule="auto" w:line="240"/>
-              <w:jc w:val="center"/>
-            </w:pPr>
-            <w:r/>
-            <w:r>
-              <w:rPr>
-                <w:rFonts w:ascii="Times New Roman" w:hAnsi="Times New Roman" w:cs="Times New Roman"/>
-                <w:b w:val="0"/>
-                <w:i w:val="0"/>
-                <w:sz w:val="20"/>
-              </w:rPr>
-              <w:t>8.9</w:t>
-            </w:r>
-          </w:p>
-        </w:tc>
-        <w:tc>
-          <w:tcPr>
-            <w:tcW w:type="dxa" w:w="1337"/>
-          </w:tcPr>
-          <w:p>
-            <w:pPr>
-              <w:spacing w:before="0" w:after="0" w:lineRule="auto" w:line="240"/>
-              <w:jc w:val="center"/>
-            </w:pPr>
-            <w:r/>
-            <w:r>
-              <w:rPr>
-                <w:rFonts w:ascii="Times New Roman" w:hAnsi="Times New Roman" w:cs="Times New Roman"/>
-                <w:b w:val="0"/>
-                <w:i w:val="0"/>
-                <w:sz w:val="20"/>
-              </w:rPr>
-              <w:t>3.7</w:t>
-            </w:r>
-          </w:p>
-        </w:tc>
-      </w:tr>
-      <w:tr>
-        <w:tc>
-          <w:tcPr>
-            <w:tcW w:type="dxa" w:w="1337"/>
-          </w:tcPr>
-          <w:p>
-            <w:pPr>
-              <w:spacing w:before="0" w:after="0" w:lineRule="auto" w:line="240"/>
-              <w:jc w:val="left"/>
-            </w:pPr>
-            <w:r/>
-            <w:r>
-              <w:rPr>
-                <w:rFonts w:ascii="Times New Roman" w:hAnsi="Times New Roman" w:cs="Times New Roman"/>
-                <w:b w:val="0"/>
-                <w:i w:val="0"/>
-                <w:sz w:val="20"/>
-              </w:rPr>
-              <w:t>Millennial</w:t>
-            </w:r>
-          </w:p>
-        </w:tc>
-        <w:tc>
-          <w:tcPr>
-            <w:tcW w:type="dxa" w:w="1337"/>
-          </w:tcPr>
-          <w:p>
-            <w:pPr>
-              <w:spacing w:before="0" w:after="0" w:lineRule="auto" w:line="240"/>
-              <w:jc w:val="center"/>
-            </w:pPr>
-            <w:r/>
-            <w:r>
-              <w:rPr>
-                <w:rFonts w:ascii="Times New Roman" w:hAnsi="Times New Roman" w:cs="Times New Roman"/>
-                <w:b w:val="0"/>
-                <w:i w:val="0"/>
-                <w:sz w:val="20"/>
-              </w:rPr>
-              <w:t>22.4</w:t>
-            </w:r>
-          </w:p>
-        </w:tc>
-        <w:tc>
-          <w:tcPr>
-            <w:tcW w:type="dxa" w:w="1337"/>
-          </w:tcPr>
-          <w:p>
-            <w:pPr>
-              <w:spacing w:before="0" w:after="0" w:lineRule="auto" w:line="240"/>
-              <w:jc w:val="center"/>
-            </w:pPr>
-            <w:r/>
-            <w:r>
-              <w:rPr>
-                <w:rFonts w:ascii="Times New Roman" w:hAnsi="Times New Roman" w:cs="Times New Roman"/>
-                <w:b w:val="0"/>
-                <w:i w:val="0"/>
-                <w:sz w:val="20"/>
-              </w:rPr>
-              <w:t>9.9</w:t>
-            </w:r>
-          </w:p>
-        </w:tc>
-        <w:tc>
-          <w:tcPr>
-            <w:tcW w:type="dxa" w:w="1337"/>
-          </w:tcPr>
-          <w:p>
-            <w:pPr>
-              <w:spacing w:before="0" w:after="0" w:lineRule="auto" w:line="240"/>
-              <w:jc w:val="center"/>
-            </w:pPr>
-            <w:r/>
-            <w:r>
-              <w:rPr>
-                <w:rFonts w:ascii="Times New Roman" w:hAnsi="Times New Roman" w:cs="Times New Roman"/>
-                <w:b w:val="0"/>
-                <w:i w:val="0"/>
-                <w:sz w:val="20"/>
-              </w:rPr>
-              <w:t>17.6</w:t>
-            </w:r>
-          </w:p>
-        </w:tc>
-        <w:tc>
-          <w:tcPr>
-            <w:tcW w:type="dxa" w:w="1337"/>
-          </w:tcPr>
-          <w:p>
-            <w:pPr>
-              <w:spacing w:before="0" w:after="0" w:lineRule="auto" w:line="240"/>
-              <w:jc w:val="center"/>
-            </w:pPr>
-            <w:r/>
-            <w:r>
-              <w:rPr>
-                <w:rFonts w:ascii="Times New Roman" w:hAnsi="Times New Roman" w:cs="Times New Roman"/>
-                <w:b w:val="0"/>
-                <w:i w:val="0"/>
-                <w:sz w:val="20"/>
-              </w:rPr>
-              <w:t>28.4</w:t>
-            </w:r>
-          </w:p>
-        </w:tc>
-        <w:tc>
-          <w:tcPr>
-            <w:tcW w:type="dxa" w:w="1337"/>
-          </w:tcPr>
-          <w:p>
-            <w:pPr>
-              <w:spacing w:before="0" w:after="0" w:lineRule="auto" w:line="240"/>
-              <w:jc w:val="center"/>
-            </w:pPr>
-            <w:r/>
-            <w:r>
-              <w:rPr>
-                <w:rFonts w:ascii="Times New Roman" w:hAnsi="Times New Roman" w:cs="Times New Roman"/>
-                <w:b w:val="0"/>
-                <w:i w:val="0"/>
-                <w:sz w:val="20"/>
-              </w:rPr>
-              <w:t>12.4</w:t>
-            </w:r>
-          </w:p>
-        </w:tc>
-        <w:tc>
-          <w:tcPr>
-            <w:tcW w:type="dxa" w:w="1337"/>
-          </w:tcPr>
-          <w:p>
-            <w:pPr>
-              <w:spacing w:before="0" w:after="0" w:lineRule="auto" w:line="240"/>
-              <w:jc w:val="center"/>
-            </w:pPr>
-            <w:r/>
-            <w:r>
-              <w:rPr>
-                <w:rFonts w:ascii="Times New Roman" w:hAnsi="Times New Roman" w:cs="Times New Roman"/>
-                <w:b w:val="0"/>
-                <w:i w:val="0"/>
-                <w:sz w:val="20"/>
-              </w:rPr>
-              <w:t>9.2</w:t>
-            </w:r>
-          </w:p>
-        </w:tc>
-      </w:tr>
-      <w:tr>
-        <w:tc>
-          <w:tcPr>
-            <w:tcW w:type="dxa" w:w="1337"/>
-          </w:tcPr>
-          <w:p>
-            <w:pPr>
-              <w:spacing w:before="0" w:after="0" w:lineRule="auto" w:line="240"/>
-              <w:jc w:val="left"/>
-            </w:pPr>
-            <w:r/>
-            <w:r>
-              <w:rPr>
-                <w:rFonts w:ascii="Times New Roman" w:hAnsi="Times New Roman" w:cs="Times New Roman"/>
-                <w:b w:val="0"/>
-                <w:i w:val="0"/>
-                <w:sz w:val="20"/>
-              </w:rPr>
-              <w:t>Gen X</w:t>
-            </w:r>
-          </w:p>
-        </w:tc>
-        <w:tc>
-          <w:tcPr>
-            <w:tcW w:type="dxa" w:w="1337"/>
-          </w:tcPr>
-          <w:p>
-            <w:pPr>
-              <w:spacing w:before="0" w:after="0" w:lineRule="auto" w:line="240"/>
-              <w:jc w:val="center"/>
-            </w:pPr>
-            <w:r/>
-            <w:r>
-              <w:rPr>
-                <w:rFonts w:ascii="Times New Roman" w:hAnsi="Times New Roman" w:cs="Times New Roman"/>
-                <w:b w:val="0"/>
-                <w:i w:val="0"/>
-                <w:sz w:val="20"/>
-              </w:rPr>
-              <w:t>18.1</w:t>
-            </w:r>
-          </w:p>
-        </w:tc>
-        <w:tc>
-          <w:tcPr>
-            <w:tcW w:type="dxa" w:w="1337"/>
-          </w:tcPr>
-          <w:p>
-            <w:pPr>
-              <w:spacing w:before="0" w:after="0" w:lineRule="auto" w:line="240"/>
-              <w:jc w:val="center"/>
-            </w:pPr>
-            <w:r/>
-            <w:r>
-              <w:rPr>
-                <w:rFonts w:ascii="Times New Roman" w:hAnsi="Times New Roman" w:cs="Times New Roman"/>
-                <w:b w:val="0"/>
-                <w:i w:val="0"/>
-                <w:sz w:val="20"/>
-              </w:rPr>
-              <w:t>6.6</w:t>
-            </w:r>
-          </w:p>
-        </w:tc>
-        <w:tc>
-          <w:tcPr>
-            <w:tcW w:type="dxa" w:w="1337"/>
-          </w:tcPr>
-          <w:p>
-            <w:pPr>
-              <w:spacing w:before="0" w:after="0" w:lineRule="auto" w:line="240"/>
-              <w:jc w:val="center"/>
-            </w:pPr>
-            <w:r/>
-            <w:r>
-              <w:rPr>
-                <w:rFonts w:ascii="Times New Roman" w:hAnsi="Times New Roman" w:cs="Times New Roman"/>
-                <w:b w:val="0"/>
-                <w:i w:val="0"/>
-                <w:sz w:val="20"/>
-              </w:rPr>
-              <w:t>16.9</w:t>
-            </w:r>
-          </w:p>
-        </w:tc>
-        <w:tc>
-          <w:tcPr>
-            <w:tcW w:type="dxa" w:w="1337"/>
-          </w:tcPr>
-          <w:p>
-            <w:pPr>
-              <w:spacing w:before="0" w:after="0" w:lineRule="auto" w:line="240"/>
-              <w:jc w:val="center"/>
-            </w:pPr>
-            <w:r/>
-            <w:r>
-              <w:rPr>
-                <w:rFonts w:ascii="Times New Roman" w:hAnsi="Times New Roman" w:cs="Times New Roman"/>
-                <w:b w:val="0"/>
-                <w:i w:val="0"/>
-                <w:sz w:val="20"/>
-              </w:rPr>
-              <w:t>33.6</w:t>
-            </w:r>
-          </w:p>
-        </w:tc>
-        <w:tc>
-          <w:tcPr>
-            <w:tcW w:type="dxa" w:w="1337"/>
-          </w:tcPr>
-          <w:p>
-            <w:pPr>
-              <w:spacing w:before="0" w:after="0" w:lineRule="auto" w:line="240"/>
-              <w:jc w:val="center"/>
-            </w:pPr>
-            <w:r/>
-            <w:r>
-              <w:rPr>
-                <w:rFonts w:ascii="Times New Roman" w:hAnsi="Times New Roman" w:cs="Times New Roman"/>
-                <w:b w:val="0"/>
-                <w:i w:val="0"/>
-                <w:sz w:val="20"/>
-              </w:rPr>
-              <w:t>12.3</w:t>
-            </w:r>
-          </w:p>
-        </w:tc>
-        <w:tc>
-          <w:tcPr>
-            <w:tcW w:type="dxa" w:w="1337"/>
-          </w:tcPr>
-          <w:p>
-            <w:pPr>
-              <w:spacing w:before="0" w:after="0" w:lineRule="auto" w:line="240"/>
-              <w:jc w:val="center"/>
-            </w:pPr>
-            <w:r/>
-            <w:r>
-              <w:rPr>
-                <w:rFonts w:ascii="Times New Roman" w:hAnsi="Times New Roman" w:cs="Times New Roman"/>
-                <w:b w:val="0"/>
-                <w:i w:val="0"/>
-                <w:sz w:val="20"/>
-              </w:rPr>
-              <w:t>12.5</w:t>
-            </w:r>
-          </w:p>
-        </w:tc>
-      </w:tr>
-      <w:tr>
-        <w:tc>
-          <w:tcPr>
-            <w:tcW w:type="dxa" w:w="1337"/>
-          </w:tcPr>
-          <w:p>
-            <w:pPr>
-              <w:spacing w:before="0" w:after="0" w:lineRule="auto" w:line="240"/>
-              <w:jc w:val="left"/>
-            </w:pPr>
-            <w:r/>
-            <w:r>
-              <w:rPr>
-                <w:rFonts w:ascii="Times New Roman" w:hAnsi="Times New Roman" w:cs="Times New Roman"/>
-                <w:b w:val="0"/>
-                <w:i w:val="0"/>
-                <w:sz w:val="20"/>
-              </w:rPr>
-              <w:t>Boomer</w:t>
-            </w:r>
-          </w:p>
-        </w:tc>
-        <w:tc>
-          <w:tcPr>
-            <w:tcW w:type="dxa" w:w="1337"/>
-          </w:tcPr>
-          <w:p>
-            <w:pPr>
-              <w:spacing w:before="0" w:after="0" w:lineRule="auto" w:line="240"/>
-              <w:jc w:val="center"/>
-            </w:pPr>
-            <w:r/>
-            <w:r>
-              <w:rPr>
-                <w:rFonts w:ascii="Times New Roman" w:hAnsi="Times New Roman" w:cs="Times New Roman"/>
-                <w:b w:val="0"/>
-                <w:i w:val="0"/>
-                <w:sz w:val="20"/>
-              </w:rPr>
-              <w:t>15.3</w:t>
-            </w:r>
-          </w:p>
-        </w:tc>
-        <w:tc>
-          <w:tcPr>
-            <w:tcW w:type="dxa" w:w="1337"/>
-          </w:tcPr>
-          <w:p>
-            <w:pPr>
-              <w:spacing w:before="0" w:after="0" w:lineRule="auto" w:line="240"/>
-              <w:jc w:val="center"/>
-            </w:pPr>
-            <w:r/>
-            <w:r>
-              <w:rPr>
-                <w:rFonts w:ascii="Times New Roman" w:hAnsi="Times New Roman" w:cs="Times New Roman"/>
-                <w:b w:val="0"/>
-                <w:i w:val="0"/>
-                <w:sz w:val="20"/>
-              </w:rPr>
-              <w:t>5.1</w:t>
-            </w:r>
-          </w:p>
-        </w:tc>
-        <w:tc>
-          <w:tcPr>
-            <w:tcW w:type="dxa" w:w="1337"/>
-          </w:tcPr>
-          <w:p>
-            <w:pPr>
-              <w:spacing w:before="0" w:after="0" w:lineRule="auto" w:line="240"/>
-              <w:jc w:val="center"/>
-            </w:pPr>
-            <w:r/>
-            <w:r>
-              <w:rPr>
-                <w:rFonts w:ascii="Times New Roman" w:hAnsi="Times New Roman" w:cs="Times New Roman"/>
-                <w:b w:val="0"/>
-                <w:i w:val="0"/>
-                <w:sz w:val="20"/>
-              </w:rPr>
-              <w:t>16.9</w:t>
-            </w:r>
-          </w:p>
-        </w:tc>
-        <w:tc>
-          <w:tcPr>
-            <w:tcW w:type="dxa" w:w="1337"/>
-          </w:tcPr>
-          <w:p>
-            <w:pPr>
-              <w:spacing w:before="0" w:after="0" w:lineRule="auto" w:line="240"/>
-              <w:jc w:val="center"/>
-            </w:pPr>
-            <w:r/>
-            <w:r>
-              <w:rPr>
-                <w:rFonts w:ascii="Times New Roman" w:hAnsi="Times New Roman" w:cs="Times New Roman"/>
-                <w:b w:val="0"/>
-                <w:i w:val="0"/>
-                <w:sz w:val="20"/>
-              </w:rPr>
-              <w:t>35.9</w:t>
-            </w:r>
-          </w:p>
-        </w:tc>
-        <w:tc>
-          <w:tcPr>
-            <w:tcW w:type="dxa" w:w="1337"/>
-          </w:tcPr>
-          <w:p>
-            <w:pPr>
-              <w:spacing w:before="0" w:after="0" w:lineRule="auto" w:line="240"/>
-              <w:jc w:val="center"/>
-            </w:pPr>
-            <w:r/>
-            <w:r>
-              <w:rPr>
-                <w:rFonts w:ascii="Times New Roman" w:hAnsi="Times New Roman" w:cs="Times New Roman"/>
-                <w:b w:val="0"/>
-                <w:i w:val="0"/>
-                <w:sz w:val="20"/>
-              </w:rPr>
-              <w:t>11.7</w:t>
-            </w:r>
-          </w:p>
-        </w:tc>
-        <w:tc>
-          <w:tcPr>
-            <w:tcW w:type="dxa" w:w="1337"/>
-          </w:tcPr>
-          <w:p>
-            <w:pPr>
-              <w:spacing w:before="0" w:after="0" w:lineRule="auto" w:line="240"/>
-              <w:jc w:val="center"/>
-            </w:pPr>
-            <w:r/>
-            <w:r>
-              <w:rPr>
-                <w:rFonts w:ascii="Times New Roman" w:hAnsi="Times New Roman" w:cs="Times New Roman"/>
-                <w:b w:val="0"/>
-                <w:i w:val="0"/>
-                <w:sz w:val="20"/>
-              </w:rPr>
-              <w:t>15.1</w:t>
-            </w:r>
-          </w:p>
-        </w:tc>
-      </w:tr>
-      <w:tr>
-        <w:tc>
-          <w:tcPr>
-            <w:tcW w:type="dxa" w:w="1337"/>
-          </w:tcPr>
-          <w:p>
-            <w:pPr>
-              <w:spacing w:before="0" w:after="0" w:lineRule="auto" w:line="240"/>
-              <w:jc w:val="left"/>
-            </w:pPr>
-            <w:r/>
-            <w:r>
-              <w:rPr>
-                <w:rFonts w:ascii="Times New Roman" w:hAnsi="Times New Roman" w:cs="Times New Roman"/>
-                <w:b w:val="0"/>
-                <w:i w:val="0"/>
-                <w:sz w:val="20"/>
-              </w:rPr>
-              <w:t>Silent</w:t>
-            </w:r>
-          </w:p>
-        </w:tc>
-        <w:tc>
-          <w:tcPr>
-            <w:tcW w:type="dxa" w:w="1337"/>
-          </w:tcPr>
-          <w:p>
-            <w:pPr>
-              <w:spacing w:before="0" w:after="0" w:lineRule="auto" w:line="240"/>
-              <w:jc w:val="center"/>
-            </w:pPr>
-            <w:r/>
-            <w:r>
-              <w:rPr>
-                <w:rFonts w:ascii="Times New Roman" w:hAnsi="Times New Roman" w:cs="Times New Roman"/>
-                <w:b w:val="0"/>
-                <w:i w:val="0"/>
-                <w:sz w:val="20"/>
-              </w:rPr>
-              <w:t>16.8</w:t>
-            </w:r>
-          </w:p>
-        </w:tc>
-        <w:tc>
-          <w:tcPr>
-            <w:tcW w:type="dxa" w:w="1337"/>
-          </w:tcPr>
-          <w:p>
-            <w:pPr>
-              <w:spacing w:before="0" w:after="0" w:lineRule="auto" w:line="240"/>
-              <w:jc w:val="center"/>
-            </w:pPr>
-            <w:r/>
-            <w:r>
-              <w:rPr>
-                <w:rFonts w:ascii="Times New Roman" w:hAnsi="Times New Roman" w:cs="Times New Roman"/>
-                <w:b w:val="0"/>
-                <w:i w:val="0"/>
-                <w:sz w:val="20"/>
-              </w:rPr>
-              <w:t>4.4</w:t>
-            </w:r>
-          </w:p>
-        </w:tc>
-        <w:tc>
-          <w:tcPr>
-            <w:tcW w:type="dxa" w:w="1337"/>
-          </w:tcPr>
-          <w:p>
-            <w:pPr>
-              <w:spacing w:before="0" w:after="0" w:lineRule="auto" w:line="240"/>
-              <w:jc w:val="center"/>
-            </w:pPr>
-            <w:r/>
-            <w:r>
-              <w:rPr>
-                <w:rFonts w:ascii="Times New Roman" w:hAnsi="Times New Roman" w:cs="Times New Roman"/>
-                <w:b w:val="0"/>
-                <w:i w:val="0"/>
-                <w:sz w:val="20"/>
-              </w:rPr>
-              <w:t>18.7</w:t>
-            </w:r>
-          </w:p>
-        </w:tc>
-        <w:tc>
-          <w:tcPr>
-            <w:tcW w:type="dxa" w:w="1337"/>
-          </w:tcPr>
-          <w:p>
-            <w:pPr>
-              <w:spacing w:before="0" w:after="0" w:lineRule="auto" w:line="240"/>
-              <w:jc w:val="center"/>
-            </w:pPr>
-            <w:r/>
-            <w:r>
-              <w:rPr>
-                <w:rFonts w:ascii="Times New Roman" w:hAnsi="Times New Roman" w:cs="Times New Roman"/>
-                <w:b w:val="0"/>
-                <w:i w:val="0"/>
-                <w:sz w:val="20"/>
-              </w:rPr>
-              <w:t>41.9</w:t>
-            </w:r>
-          </w:p>
-        </w:tc>
-        <w:tc>
-          <w:tcPr>
-            <w:tcW w:type="dxa" w:w="1337"/>
-          </w:tcPr>
-          <w:p>
-            <w:pPr>
-              <w:spacing w:before="0" w:after="0" w:lineRule="auto" w:line="240"/>
-              <w:jc w:val="center"/>
-            </w:pPr>
-            <w:r/>
-            <w:r>
-              <w:rPr>
-                <w:rFonts w:ascii="Times New Roman" w:hAnsi="Times New Roman" w:cs="Times New Roman"/>
-                <w:b w:val="0"/>
-                <w:i w:val="0"/>
-                <w:sz w:val="20"/>
-              </w:rPr>
-              <w:t>6.6</w:t>
-            </w:r>
-          </w:p>
-        </w:tc>
-        <w:tc>
-          <w:tcPr>
-            <w:tcW w:type="dxa" w:w="1337"/>
-          </w:tcPr>
-          <w:p>
-            <w:pPr>
-              <w:spacing w:before="0" w:after="0" w:lineRule="auto" w:line="240"/>
-              <w:jc w:val="center"/>
-            </w:pPr>
-            <w:r/>
-            <w:r>
-              <w:rPr>
-                <w:rFonts w:ascii="Times New Roman" w:hAnsi="Times New Roman" w:cs="Times New Roman"/>
-                <w:b w:val="0"/>
-                <w:i w:val="0"/>
-                <w:sz w:val="20"/>
-              </w:rPr>
-              <w:t>11.5</w:t>
-            </w:r>
-          </w:p>
-        </w:tc>
-      </w:tr>
-    </w:tbl>
-    <w:p>
-      <w:pPr>
-        <w:spacing w:before="80" w:after="240" w:lineRule="auto" w:line="480"/>
-      </w:pPr>
+        <w:t>The generational distribution across profiles was pronounced (Figure 3). Over a third of Gen Z (35.3%) fell into the Isolated Disengaged profile—more than double the Boomer rate (15.3%)—while only 3.7% of Gen Z reached Fully Engaged status (vs. 15.1% of Boomers). Combining the two socially isolated profiles (Isolated Disengaged and Politically Aware Isolated), over half of Gen Z (50.6%) occupied profiles defined by social disconnection. These proportions were essentially unchanged between the pre- and post-COVID periods (Isolated Disengaged: 35.5% vs. 35.2%), providing person-centered corroboration of the regression-based temporal stability finding. The concentration of Gen Z in socially disconnected profiles is striking in absolute terms: more than one in three Gen Z respondents fell into the profile defined by minimal engagement on every civic indicator—a rate suggesting that social disconnection is not a marginal phenomenon among young adults but a dominant pattern.</w:t>
+      </w:r>
     </w:p>
     <w:p>
       <w:pPr>
@@ -6533,7 +5593,7 @@
       <w:r>
         <w:drawing>
           <wp:inline xmlns:a="http://schemas.openxmlformats.org/drawingml/2006/main" xmlns:pic="http://schemas.openxmlformats.org/drawingml/2006/picture">
-            <wp:extent cx="5029200" cy="3424216"/>
+            <wp:extent cx="5029200" cy="3246244"/>
             <wp:docPr id="4" name="Picture 4"/>
             <wp:cNvGraphicFramePr>
               <a:graphicFrameLocks noChangeAspect="1"/>
@@ -6542,7 +5602,7 @@
               <a:graphicData uri="http://schemas.openxmlformats.org/drawingml/2006/picture">
                 <pic:pic>
                   <pic:nvPicPr>
-                    <pic:cNvPr id="0" name="shap_all_generations.png"/>
+                    <pic:cNvPr id="0" name="shap_soc_vs_edu_generations.png"/>
                     <pic:cNvPicPr/>
                   </pic:nvPicPr>
                   <pic:blipFill>
@@ -6554,7 +5614,7 @@
                   <pic:spPr>
                     <a:xfrm>
                       <a:off x="0" y="0"/>
-                      <a:ext cx="5029200" cy="3424216"/>
+                      <a:ext cx="5029200" cy="3246244"/>
                     </a:xfrm>
                     <a:prstGeom prst="rect"/>
                   </pic:spPr>
@@ -6586,7 +5646,7 @@
           <w:i w:val="0"/>
           <w:sz w:val="24"/>
         </w:rPr>
-        <w:t>Feature importance (mean |SHAP|) by generation from gradient boosting model. Socialization frequency ranks as the most important predictor for Gen Z; education ranks first for all other generations.</w:t>
+        <w:t>Predictor importance reversal across generations. Mean |SHAP| values for socialization frequency and education from gradient boosting model. Gen Z is the only generation for which socialization outranks education as the strongest predictor of volunteering.</w:t>
       </w:r>
     </w:p>
     <w:p>
@@ -6753,7 +5813,7 @@
           <w:i w:val="0"/>
           <w:sz w:val="24"/>
         </w:rPr>
-        <w:t>The person-centered analysis reinforced these findings through a complementary lens. Gen Z was disproportionately concentrated in socially disconnected profiles (see Table 4): over half (50.6%) occupied the Isolated Disengaged or Politically Aware Isolated classes, and only 3.7% reached Fully Engaged status—consistent with H4 and H5. These proportions were essentially unchanged across the pre- and post-COVID periods, corroborating the temporal stability finding.</w:t>
+        <w:t>The person-centered analysis reinforced these findings through a complementary lens. Gen Z was disproportionately concentrated in socially disconnected profiles (see Figure 3): over half (50.6%) occupied the Isolated Disengaged or Politically Aware Isolated classes, and only 3.7% reached Fully Engaged status—consistent with H4 and H5. These proportions were essentially unchanged across the pre- and post-COVID periods, corroborating the temporal stability finding.</w:t>
       </w:r>
     </w:p>
     <w:p>

</xml_diff>

<commit_message>
Remove Figure 4 and clean up unused figures
- Remove Figure 4 (SHAP) from paper pending advanced visualization
- Delete 12 unused figures from figures/ directory
- Keep only 3 active figures: pred_prob_soc_gen, lpa_profile_heatmap,
  lpa_generation_distribution
- Update build_docx.py and results text accordingly
- 3 tables, 3 figures, 8,922 words

Co-Authored-By: Claude Opus 4.6 <noreply@anthropic.com>
</commit_message>
<xml_diff>
--- a/paper/Bowling_Alone_CLEAN.docx
+++ b/paper/Bowling_Alone_CLEAN.docx
@@ -5577,76 +5577,7 @@
           <w:i w:val="0"/>
           <w:sz w:val="24"/>
         </w:rPr>
-        <w:t>The regression and profile analyses both rely on researcher-specified variable roles. A final analysis asked whether an algorithm with no imposed structure reaches the same conclusion. An XGBoost classifier trained on the full covariate set achieved test-set AUC = .731, comparable to prior survey-based models of volunteering. TreeSHAP decomposition revealed a generation-specific reversal in feature importance (Figure 4): socialization frequency was the single most important predictor of volunteering for Gen Z (mean |SHAP| = 0.467, indicating that socialization shifted the predicted probability by an average of 0.47 on the log-odds scale), whereas education ranked first for every other generation (mean |SHAP| = 0.426–0.472). SHAP dependence plots independently recovered both the First Step Effect—the steepest gradient at the lowest socialization transition—and the Gen Z plateau, confirming that these patterns are not artifacts of the parametric regression specification. The convergence across methods is itself a finding: a flexible machine learning algorithm, given no information about which variables should interact or where thresholds should fall, independently identified the same two patterns discovered through theory-guided regression—the First Step Effect and the Gen Z plateau—strengthening confidence that these patterns reflect genuine features of the data rather than modeling choices.</w:t>
-      </w:r>
-    </w:p>
-    <w:p>
-      <w:pPr>
-        <w:spacing w:before="120" w:after="0" w:lineRule="auto" w:line="240"/>
-      </w:pPr>
-    </w:p>
-    <w:p>
-      <w:pPr>
-        <w:spacing w:before="0" w:after="80" w:lineRule="auto" w:line="240"/>
-        <w:jc w:val="center"/>
-      </w:pPr>
-      <w:r>
-        <w:drawing>
-          <wp:inline xmlns:a="http://schemas.openxmlformats.org/drawingml/2006/main" xmlns:pic="http://schemas.openxmlformats.org/drawingml/2006/picture">
-            <wp:extent cx="5029200" cy="3246244"/>
-            <wp:docPr id="4" name="Picture 4"/>
-            <wp:cNvGraphicFramePr>
-              <a:graphicFrameLocks noChangeAspect="1"/>
-            </wp:cNvGraphicFramePr>
-            <a:graphic>
-              <a:graphicData uri="http://schemas.openxmlformats.org/drawingml/2006/picture">
-                <pic:pic>
-                  <pic:nvPicPr>
-                    <pic:cNvPr id="0" name="shap_soc_vs_edu_generations.png"/>
-                    <pic:cNvPicPr/>
-                  </pic:nvPicPr>
-                  <pic:blipFill>
-                    <a:blip r:embed="rId12"/>
-                    <a:stretch>
-                      <a:fillRect/>
-                    </a:stretch>
-                  </pic:blipFill>
-                  <pic:spPr>
-                    <a:xfrm>
-                      <a:off x="0" y="0"/>
-                      <a:ext cx="5029200" cy="3246244"/>
-                    </a:xfrm>
-                    <a:prstGeom prst="rect"/>
-                  </pic:spPr>
-                </pic:pic>
-              </a:graphicData>
-            </a:graphic>
-          </wp:inline>
-        </w:drawing>
-      </w:r>
-    </w:p>
-    <w:p>
-      <w:pPr>
-        <w:spacing w:before="80" w:after="240" w:lineRule="auto" w:line="480"/>
-        <w:jc w:val="left"/>
-      </w:pPr>
-      <w:r>
-        <w:rPr>
-          <w:rFonts w:ascii="Times New Roman" w:hAnsi="Times New Roman" w:cs="Times New Roman"/>
-          <w:b w:val="0"/>
-          <w:i/>
-          <w:sz w:val="24"/>
-        </w:rPr>
-        <w:t xml:space="preserve">Figure 4. </w:t>
-      </w:r>
-      <w:r>
-        <w:rPr>
-          <w:rFonts w:ascii="Times New Roman" w:hAnsi="Times New Roman" w:cs="Times New Roman"/>
-          <w:b w:val="0"/>
-          <w:i w:val="0"/>
-          <w:sz w:val="24"/>
-        </w:rPr>
-        <w:t>Predictor importance reversal across generations. Mean |SHAP| values for socialization frequency and education from gradient boosting model. Gen Z is the only generation for which socialization outranks education as the strongest predictor of volunteering.</w:t>
+        <w:t>The regression and profile analyses both rely on researcher-specified variable roles. A final analysis asked whether an algorithm with no imposed structure reaches the same conclusion. An XGBoost classifier trained on the full covariate set achieved test-set AUC = .731, comparable to prior survey-based models of volunteering. TreeSHAP decomposition revealed a generation-specific reversal in feature importance: socialization frequency was the single most important predictor of volunteering for Gen Z (mean |SHAP| = 0.467, indicating that socialization shifted the predicted probability by an average of 0.47 on the log-odds scale), whereas education ranked first for every other generation (mean |SHAP| = 0.426–0.472). SHAP dependence plots independently recovered both the First Step Effect—the steepest gradient at the lowest socialization transition—and the Gen Z plateau, confirming that these patterns are not artifacts of the parametric regression specification. The convergence across methods is itself a finding: a flexible machine learning algorithm, given no information about which variables should interact or where thresholds should fall, independently identified the same two patterns discovered through theory-guided regression—the First Step Effect and the Gen Z plateau—strengthening confidence that these patterns reflect genuine features of the data rather than modeling choices.</w:t>
       </w:r>
     </w:p>
     <w:p>

</xml_diff>

<commit_message>
Add advanced SHAP visualizations (Figures 4–5)
Figure 4: Two-panel SHAP beeswarm comparing Gen Z vs older cohorts,
showing full SHAP value distributions for top 12 predictors with
feature-value color encoding. Figure 5: Faceted SHAP dependence
plot for socialization frequency with annotated First Step Effect
and Gen Z plateau. Updated results and discussion with figure
references; rebuilt DOCX.

Co-Authored-By: Claude Opus 4.6 <noreply@anthropic.com>
</commit_message>
<xml_diff>
--- a/paper/Bowling_Alone_CLEAN.docx
+++ b/paper/Bowling_Alone_CLEAN.docx
@@ -5577,7 +5577,145 @@
           <w:i w:val="0"/>
           <w:sz w:val="24"/>
         </w:rPr>
-        <w:t>The regression and profile analyses both rely on researcher-specified variable roles. A final analysis asked whether an algorithm with no imposed structure reaches the same conclusion. An XGBoost classifier trained on the full covariate set achieved test-set AUC = .731, comparable to prior survey-based models of volunteering. TreeSHAP decomposition revealed a generation-specific reversal in feature importance: socialization frequency was the single most important predictor of volunteering for Gen Z (mean |SHAP| = 0.467, indicating that socialization shifted the predicted probability by an average of 0.47 on the log-odds scale), whereas education ranked first for every other generation (mean |SHAP| = 0.426–0.472). SHAP dependence plots independently recovered both the First Step Effect—the steepest gradient at the lowest socialization transition—and the Gen Z plateau, confirming that these patterns are not artifacts of the parametric regression specification. The convergence across methods is itself a finding: a flexible machine learning algorithm, given no information about which variables should interact or where thresholds should fall, independently identified the same two patterns discovered through theory-guided regression—the First Step Effect and the Gen Z plateau—strengthening confidence that these patterns reflect genuine features of the data rather than modeling choices.</w:t>
+        <w:t>The regression and profile analyses both rely on researcher-specified variable roles. A final analysis asked whether an algorithm with no imposed structure reaches the same conclusion. An XGBoost classifier trained on the full covariate set achieved test-set AUC = .731, comparable to prior survey-based models of volunteering. TreeSHAP decomposition revealed a generation-specific reversal in feature importance: socialization frequency was the single most important predictor of volunteering for Gen Z (mean |SHAP| = 0.467, indicating that socialization shifted the predicted probability by an average of 0.47 on the log-odds scale), whereas education ranked first for every other generation (mean |SHAP| = 0.426–0.472). Figure 4 displays the full SHAP value distributions for Gen Z alongside older cohorts, illustrating not only the importance reversal but also the directionality and heterogeneity of each predictor's contribution. SHAP dependence plots independently recovered both the First Step Effect—the steepest gradient at the lowest socialization transition—and the Gen Z plateau (Figure 5), confirming that these patterns are not artifacts of the parametric regression specification. The convergence across methods is itself a finding: a flexible machine learning algorithm, given no information about which variables should interact or where thresholds should fall, independently identified the same two patterns discovered through theory-guided regression—the First Step Effect and the Gen Z plateau—strengthening confidence that these patterns reflect genuine features of the data rather than modeling choices.</w:t>
+      </w:r>
+    </w:p>
+    <w:p>
+      <w:pPr>
+        <w:spacing w:before="120" w:after="0" w:lineRule="auto" w:line="240"/>
+      </w:pPr>
+    </w:p>
+    <w:p>
+      <w:pPr>
+        <w:spacing w:before="0" w:after="80" w:lineRule="auto" w:line="240"/>
+        <w:jc w:val="center"/>
+      </w:pPr>
+      <w:r>
+        <w:drawing>
+          <wp:inline xmlns:a="http://schemas.openxmlformats.org/drawingml/2006/main" xmlns:pic="http://schemas.openxmlformats.org/drawingml/2006/picture">
+            <wp:extent cx="5029200" cy="2922502"/>
+            <wp:docPr id="4" name="Picture 4"/>
+            <wp:cNvGraphicFramePr>
+              <a:graphicFrameLocks noChangeAspect="1"/>
+            </wp:cNvGraphicFramePr>
+            <a:graphic>
+              <a:graphicData uri="http://schemas.openxmlformats.org/drawingml/2006/picture">
+                <pic:pic>
+                  <pic:nvPicPr>
+                    <pic:cNvPr id="0" name="shap_beeswarm_genz_vs_older.png"/>
+                    <pic:cNvPicPr/>
+                  </pic:nvPicPr>
+                  <pic:blipFill>
+                    <a:blip r:embed="rId12"/>
+                    <a:stretch>
+                      <a:fillRect/>
+                    </a:stretch>
+                  </pic:blipFill>
+                  <pic:spPr>
+                    <a:xfrm>
+                      <a:off x="0" y="0"/>
+                      <a:ext cx="5029200" cy="2922502"/>
+                    </a:xfrm>
+                    <a:prstGeom prst="rect"/>
+                  </pic:spPr>
+                </pic:pic>
+              </a:graphicData>
+            </a:graphic>
+          </wp:inline>
+        </w:drawing>
+      </w:r>
+    </w:p>
+    <w:p>
+      <w:pPr>
+        <w:spacing w:before="80" w:after="240" w:lineRule="auto" w:line="480"/>
+        <w:jc w:val="left"/>
+      </w:pPr>
+      <w:r>
+        <w:rPr>
+          <w:rFonts w:ascii="Times New Roman" w:hAnsi="Times New Roman" w:cs="Times New Roman"/>
+          <w:b w:val="0"/>
+          <w:i/>
+          <w:sz w:val="24"/>
+        </w:rPr>
+        <w:t xml:space="preserve">Figure 4. </w:t>
+      </w:r>
+      <w:r>
+        <w:rPr>
+          <w:rFonts w:ascii="Times New Roman" w:hAnsi="Times New Roman" w:cs="Times New Roman"/>
+          <w:b w:val="0"/>
+          <w:i w:val="0"/>
+          <w:sz w:val="24"/>
+        </w:rPr>
+        <w:t>SHAP value distributions for Generation Z (left) versus older cohorts (right), showing the top 12 predictors ranked by mean absolute SHAP value for Gen Z. Color encodes feature value (blue = low, red = high). Socialization frequency is the most important predictor for Gen Z, whereas education dominates for older cohorts.</w:t>
+      </w:r>
+    </w:p>
+    <w:p>
+      <w:pPr>
+        <w:spacing w:before="120" w:after="0" w:lineRule="auto" w:line="240"/>
+      </w:pPr>
+    </w:p>
+    <w:p>
+      <w:pPr>
+        <w:spacing w:before="0" w:after="80" w:lineRule="auto" w:line="240"/>
+        <w:jc w:val="center"/>
+      </w:pPr>
+      <w:r>
+        <w:drawing>
+          <wp:inline xmlns:a="http://schemas.openxmlformats.org/drawingml/2006/main" xmlns:pic="http://schemas.openxmlformats.org/drawingml/2006/picture">
+            <wp:extent cx="5029200" cy="2272822"/>
+            <wp:docPr id="5" name="Picture 5"/>
+            <wp:cNvGraphicFramePr>
+              <a:graphicFrameLocks noChangeAspect="1"/>
+            </wp:cNvGraphicFramePr>
+            <a:graphic>
+              <a:graphicData uri="http://schemas.openxmlformats.org/drawingml/2006/picture">
+                <pic:pic>
+                  <pic:nvPicPr>
+                    <pic:cNvPr id="0" name="shap_dependence_soc_faceted.png"/>
+                    <pic:cNvPicPr/>
+                  </pic:nvPicPr>
+                  <pic:blipFill>
+                    <a:blip r:embed="rId13"/>
+                    <a:stretch>
+                      <a:fillRect/>
+                    </a:stretch>
+                  </pic:blipFill>
+                  <pic:spPr>
+                    <a:xfrm>
+                      <a:off x="0" y="0"/>
+                      <a:ext cx="5029200" cy="2272822"/>
+                    </a:xfrm>
+                    <a:prstGeom prst="rect"/>
+                  </pic:spPr>
+                </pic:pic>
+              </a:graphicData>
+            </a:graphic>
+          </wp:inline>
+        </w:drawing>
+      </w:r>
+    </w:p>
+    <w:p>
+      <w:pPr>
+        <w:spacing w:before="80" w:after="240" w:lineRule="auto" w:line="480"/>
+        <w:jc w:val="left"/>
+      </w:pPr>
+      <w:r>
+        <w:rPr>
+          <w:rFonts w:ascii="Times New Roman" w:hAnsi="Times New Roman" w:cs="Times New Roman"/>
+          <w:b w:val="0"/>
+          <w:i/>
+          <w:sz w:val="24"/>
+        </w:rPr>
+        <w:t xml:space="preserve">Figure 5. </w:t>
+      </w:r>
+      <w:r>
+        <w:rPr>
+          <w:rFonts w:ascii="Times New Roman" w:hAnsi="Times New Roman" w:cs="Times New Roman"/>
+          <w:b w:val="0"/>
+          <w:i w:val="0"/>
+          <w:sz w:val="24"/>
+        </w:rPr>
+        <w:t>SHAP dependence plots for in-person socialization frequency. Left panel: Gen Z, with annotations marking the First Step Effect (steep initial rise) and plateau (flattening beyond moderate socialization). Right panel: Older cohorts, with generation-specific trend lines and 95% confidence bands showing continuous returns from increased socialization.</w:t>
       </w:r>
     </w:p>
     <w:p>
@@ -5792,7 +5930,7 @@
           <w:i w:val="0"/>
           <w:sz w:val="24"/>
         </w:rPr>
-        <w:t>Socialization's dominance for Gen Z was confirmed by a model with no imposed interaction structure. In the gradient boosting analysis, socialization ranked as the single most important predictor of volunteering for Gen Z, outranking education—the top predictor for every older generation (see Figure 4). For older cohorts with established social networks, the traditional civic voluntarism resources of education and employment retain their predictive primacy (Verba et al., 1995). SHAP dependence plots independently recovered both the First Step Effect and the Gen Z plateau, confirming that these patterns are not artifacts of the parametric regression specification. The concave dose–response shape at the lowest socialization transition—not a statistically novel pattern in itself—carries civic implications that have not been previously documented across five generational cohorts.</w:t>
+        <w:t>Socialization's dominance for Gen Z was confirmed by a model with no imposed interaction structure. In the gradient boosting analysis, socialization ranked as the single most important predictor of volunteering for Gen Z, outranking education—the top predictor for every older generation (see Figure 4). For older cohorts with established social networks, the traditional civic voluntarism resources of education and employment retain their predictive primacy (Verba et al., 1995). SHAP dependence plots independently recovered both the First Step Effect and the Gen Z plateau (see Figure 5), confirming that these patterns are not artifacts of the parametric regression specification. The concave dose–response shape at the lowest socialization transition—not a statistically novel pattern in itself—carries civic implications that have not been previously documented across five generational cohorts.</w:t>
       </w:r>
     </w:p>
     <w:p>

</xml_diff>

<commit_message>
Remove SHAP figures, retain text-only SHAP reporting
After evaluating beeswarm, dependence, interaction, and decision
plot approaches, concluded that no SHAP visualization adds
non-redundant information beyond Figure 1. SHAP analysis results
(importance reversal, First Step Effect, plateau confirmation)
are fully reported in Predictive Validation text. Paper finalized
with Figures 1-3 only. Exploratory scripts retained in code/.

Co-Authored-By: Claude Opus 4.6 <noreply@anthropic.com>
</commit_message>
<xml_diff>
--- a/paper/Bowling_Alone_CLEAN.docx
+++ b/paper/Bowling_Alone_CLEAN.docx
@@ -5577,145 +5577,7 @@
           <w:i w:val="0"/>
           <w:sz w:val="24"/>
         </w:rPr>
-        <w:t>The regression and profile analyses both rely on researcher-specified variable roles. A final analysis asked whether an algorithm with no imposed structure reaches the same conclusion. An XGBoost classifier trained on the full covariate set achieved test-set AUC = .731, comparable to prior survey-based models of volunteering. TreeSHAP decomposition revealed a generation-specific reversal in feature importance: socialization frequency was the single most important predictor of volunteering for Gen Z (mean |SHAP| = 0.467, indicating that socialization shifted the predicted probability by an average of 0.47 on the log-odds scale), whereas education ranked first for every other generation (mean |SHAP| = 0.426–0.472). Figure 4 displays the full SHAP value distributions for Gen Z alongside older cohorts, illustrating not only the importance reversal but also the directionality and heterogeneity of each predictor's contribution. SHAP dependence plots independently recovered both the First Step Effect—the steepest gradient at the lowest socialization transition—and the Gen Z plateau (Figure 5), confirming that these patterns are not artifacts of the parametric regression specification. The convergence across methods is itself a finding: a flexible machine learning algorithm, given no information about which variables should interact or where thresholds should fall, independently identified the same two patterns discovered through theory-guided regression—the First Step Effect and the Gen Z plateau—strengthening confidence that these patterns reflect genuine features of the data rather than modeling choices.</w:t>
-      </w:r>
-    </w:p>
-    <w:p>
-      <w:pPr>
-        <w:spacing w:before="120" w:after="0" w:lineRule="auto" w:line="240"/>
-      </w:pPr>
-    </w:p>
-    <w:p>
-      <w:pPr>
-        <w:spacing w:before="0" w:after="80" w:lineRule="auto" w:line="240"/>
-        <w:jc w:val="center"/>
-      </w:pPr>
-      <w:r>
-        <w:drawing>
-          <wp:inline xmlns:a="http://schemas.openxmlformats.org/drawingml/2006/main" xmlns:pic="http://schemas.openxmlformats.org/drawingml/2006/picture">
-            <wp:extent cx="5029200" cy="2922502"/>
-            <wp:docPr id="4" name="Picture 4"/>
-            <wp:cNvGraphicFramePr>
-              <a:graphicFrameLocks noChangeAspect="1"/>
-            </wp:cNvGraphicFramePr>
-            <a:graphic>
-              <a:graphicData uri="http://schemas.openxmlformats.org/drawingml/2006/picture">
-                <pic:pic>
-                  <pic:nvPicPr>
-                    <pic:cNvPr id="0" name="shap_beeswarm_genz_vs_older.png"/>
-                    <pic:cNvPicPr/>
-                  </pic:nvPicPr>
-                  <pic:blipFill>
-                    <a:blip r:embed="rId12"/>
-                    <a:stretch>
-                      <a:fillRect/>
-                    </a:stretch>
-                  </pic:blipFill>
-                  <pic:spPr>
-                    <a:xfrm>
-                      <a:off x="0" y="0"/>
-                      <a:ext cx="5029200" cy="2922502"/>
-                    </a:xfrm>
-                    <a:prstGeom prst="rect"/>
-                  </pic:spPr>
-                </pic:pic>
-              </a:graphicData>
-            </a:graphic>
-          </wp:inline>
-        </w:drawing>
-      </w:r>
-    </w:p>
-    <w:p>
-      <w:pPr>
-        <w:spacing w:before="80" w:after="240" w:lineRule="auto" w:line="480"/>
-        <w:jc w:val="left"/>
-      </w:pPr>
-      <w:r>
-        <w:rPr>
-          <w:rFonts w:ascii="Times New Roman" w:hAnsi="Times New Roman" w:cs="Times New Roman"/>
-          <w:b w:val="0"/>
-          <w:i/>
-          <w:sz w:val="24"/>
-        </w:rPr>
-        <w:t xml:space="preserve">Figure 4. </w:t>
-      </w:r>
-      <w:r>
-        <w:rPr>
-          <w:rFonts w:ascii="Times New Roman" w:hAnsi="Times New Roman" w:cs="Times New Roman"/>
-          <w:b w:val="0"/>
-          <w:i w:val="0"/>
-          <w:sz w:val="24"/>
-        </w:rPr>
-        <w:t>SHAP value distributions for Generation Z (left) versus older cohorts (right), showing the top 12 predictors ranked by mean absolute SHAP value for Gen Z. Color encodes feature value (blue = low, red = high). Socialization frequency is the most important predictor for Gen Z, whereas education dominates for older cohorts.</w:t>
-      </w:r>
-    </w:p>
-    <w:p>
-      <w:pPr>
-        <w:spacing w:before="120" w:after="0" w:lineRule="auto" w:line="240"/>
-      </w:pPr>
-    </w:p>
-    <w:p>
-      <w:pPr>
-        <w:spacing w:before="0" w:after="80" w:lineRule="auto" w:line="240"/>
-        <w:jc w:val="center"/>
-      </w:pPr>
-      <w:r>
-        <w:drawing>
-          <wp:inline xmlns:a="http://schemas.openxmlformats.org/drawingml/2006/main" xmlns:pic="http://schemas.openxmlformats.org/drawingml/2006/picture">
-            <wp:extent cx="5029200" cy="2272822"/>
-            <wp:docPr id="5" name="Picture 5"/>
-            <wp:cNvGraphicFramePr>
-              <a:graphicFrameLocks noChangeAspect="1"/>
-            </wp:cNvGraphicFramePr>
-            <a:graphic>
-              <a:graphicData uri="http://schemas.openxmlformats.org/drawingml/2006/picture">
-                <pic:pic>
-                  <pic:nvPicPr>
-                    <pic:cNvPr id="0" name="shap_dependence_soc_faceted.png"/>
-                    <pic:cNvPicPr/>
-                  </pic:nvPicPr>
-                  <pic:blipFill>
-                    <a:blip r:embed="rId13"/>
-                    <a:stretch>
-                      <a:fillRect/>
-                    </a:stretch>
-                  </pic:blipFill>
-                  <pic:spPr>
-                    <a:xfrm>
-                      <a:off x="0" y="0"/>
-                      <a:ext cx="5029200" cy="2272822"/>
-                    </a:xfrm>
-                    <a:prstGeom prst="rect"/>
-                  </pic:spPr>
-                </pic:pic>
-              </a:graphicData>
-            </a:graphic>
-          </wp:inline>
-        </w:drawing>
-      </w:r>
-    </w:p>
-    <w:p>
-      <w:pPr>
-        <w:spacing w:before="80" w:after="240" w:lineRule="auto" w:line="480"/>
-        <w:jc w:val="left"/>
-      </w:pPr>
-      <w:r>
-        <w:rPr>
-          <w:rFonts w:ascii="Times New Roman" w:hAnsi="Times New Roman" w:cs="Times New Roman"/>
-          <w:b w:val="0"/>
-          <w:i/>
-          <w:sz w:val="24"/>
-        </w:rPr>
-        <w:t xml:space="preserve">Figure 5. </w:t>
-      </w:r>
-      <w:r>
-        <w:rPr>
-          <w:rFonts w:ascii="Times New Roman" w:hAnsi="Times New Roman" w:cs="Times New Roman"/>
-          <w:b w:val="0"/>
-          <w:i w:val="0"/>
-          <w:sz w:val="24"/>
-        </w:rPr>
-        <w:t>SHAP dependence plots for in-person socialization frequency. Left panel: Gen Z, with annotations marking the First Step Effect (steep initial rise) and plateau (flattening beyond moderate socialization). Right panel: Older cohorts, with generation-specific trend lines and 95% confidence bands showing continuous returns from increased socialization.</w:t>
+        <w:t>The regression and profile analyses both rely on researcher-specified variable roles. A final analysis asked whether an algorithm with no imposed structure reaches the same conclusion. An XGBoost classifier trained on the full covariate set achieved test-set AUC = .731, comparable to prior survey-based models of volunteering. TreeSHAP decomposition revealed a generation-specific reversal in feature importance: socialization frequency was the single most important predictor of volunteering for Gen Z (mean |SHAP| = 0.467, indicating that socialization shifted the predicted probability by an average of 0.47 on the log-odds scale), whereas education ranked first for every other generation (mean |SHAP| = 0.426–0.472). SHAP dependence plots independently recovered both the First Step Effect—the steepest gradient at the lowest socialization transition—and the Gen Z plateau, confirming that these patterns are not artifacts of the parametric regression specification. The convergence across methods is itself a finding: a flexible machine learning algorithm, given no information about which variables should interact or where thresholds should fall, independently identified the same two patterns discovered through theory-guided regression—the First Step Effect and the Gen Z plateau—strengthening confidence that these patterns reflect genuine features of the data rather than modeling choices.</w:t>
       </w:r>
     </w:p>
     <w:p>
@@ -5930,7 +5792,7 @@
           <w:i w:val="0"/>
           <w:sz w:val="24"/>
         </w:rPr>
-        <w:t>Socialization's dominance for Gen Z was confirmed by a model with no imposed interaction structure. In the gradient boosting analysis, socialization ranked as the single most important predictor of volunteering for Gen Z, outranking education—the top predictor for every older generation (see Figure 4). For older cohorts with established social networks, the traditional civic voluntarism resources of education and employment retain their predictive primacy (Verba et al., 1995). SHAP dependence plots independently recovered both the First Step Effect and the Gen Z plateau (see Figure 5), confirming that these patterns are not artifacts of the parametric regression specification. The concave dose–response shape at the lowest socialization transition—not a statistically novel pattern in itself—carries civic implications that have not been previously documented across five generational cohorts.</w:t>
+        <w:t>Socialization's dominance for Gen Z was confirmed by a model with no imposed interaction structure. In the gradient boosting analysis, socialization ranked as the single most important predictor of volunteering for Gen Z, outranking education—the top predictor for every older generation . For older cohorts with established social networks, the traditional civic voluntarism resources of education and employment retain their predictive primacy (Verba et al., 1995). SHAP dependence plots independently recovered both the First Step Effect and the Gen Z plateau, confirming that these patterns are not artifacts of the parametric regression specification. The concave dose–response shape at the lowest socialization transition—not a statistically novel pattern in itself—carries civic implications that have not been previously documented across five generational cohorts.</w:t>
       </w:r>
     </w:p>
     <w:p>

</xml_diff>

<commit_message>
Rebuild DOCX from humanized manuscript sources
Co-Authored-By: Claude Opus 4.6 (1M context) <noreply@anthropic.com>
</commit_message>
<xml_diff>
--- a/paper/Bowling_Alone_CLEAN.docx
+++ b/paper/Bowling_Alone_CLEAN.docx
@@ -148,7 +148,7 @@
           <w:i w:val="0"/>
           <w:sz w:val="24"/>
         </w:rPr>
-        <w:t xml:space="preserve"> = 201,168) and two complementary analytic methods—survey-weighted logistic regression and latent profile analysis—this study examines whether in-person socialization predicts volunteering differently across five generational cohorts. Three findings emerge. First, a universal threshold: across all generations, the transition from no socialization to even occasional contact is associated with the largest marginal gain in volunteering probability (7–10 percentage points), a pattern we term the "First Step Effect." Second, Generation Z exhibits a unique ceiling: beyond moderate socialization, volunteering probability plateaus—a pattern absent in all older cohorts—yet Gen Z's volunteering probability at zero socialization (27.3%) exceeds that of every older generation, suggesting civic motivation is not the barrier. Third, these patterns are temporally stable, present before the COVID-19 pandemic and unchanged afterward, establishing them as cohort characteristics rather than pandemic artifacts. Education amplifies the socialization–volunteering gradient (</w:t>
+        <w:t xml:space="preserve"> = 201,168) and two complementary analytic methods, survey-weighted logistic regression and latent profile analysis, this study examines whether in-person socialization predicts volunteering differently across five generational cohorts. The most striking finding is a Gen Z paradox: Gen Z's volunteering probability at zero socialization (27.3%) exceeds that of every older generation, yet beyond moderate socialization levels volunteering probability plateaus, a ceiling absent in all older cohorts. This pattern points to structural barriers rather than weak civic motivation. Across all five generations, the transition from no socialization to even occasional contact is associated with the largest marginal gain in volunteering probability (7–10 percentage points), a universal "First Step Effect" comparable in magnitude to the education gradient. These patterns were present before the COVID-19 pandemic and unchanged afterward, establishing them as cohort characteristics rather than pandemic artifacts. Education amplifies the socialization–volunteering gradient (</w:t>
       </w:r>
       <w:r>
         <w:rPr>
@@ -166,7 +166,7 @@
           <w:i w:val="0"/>
           <w:sz w:val="24"/>
         </w:rPr>
-        <w:t xml:space="preserve"> = .009), but neither employment nor civic social media use alters the generational pattern. Over half of Gen Z occupies civic engagement profiles defined by social isolation. These findings are consistent with an account in which declining youth volunteering reflects social disconnection rather than weakened civic motivation, with implications for low-threshold volunteer recruitment and community-based programming.</w:t>
+        <w:t xml:space="preserve"> = .009), but neither employment nor civic social media use alters the generational pattern. Over half of Gen Z occupies civic engagement profiles defined by social isolation. The pattern is consistent with an account in which declining youth volunteering reflects social disconnection rather than weakened civic motivation, with implications for low-threshold volunteer recruitment and community-based programming.</w:t>
       </w:r>
     </w:p>
     <w:p>
@@ -227,7 +227,7 @@
           <w:i w:val="0"/>
           <w:sz w:val="24"/>
         </w:rPr>
-        <w:t xml:space="preserve">In May 2023, the U.S. Surgeon General declared loneliness and social isolation a public health epidemic, documenting extensive consequences for mental health, physical well-being, and mortality (Office of the Surgeon General, 2023). Yet while the health effects of social disconnection have received considerable empirical attention, one domain remains underexamined: the civic consequences of social disconnection, and particularly its effects on volunteering. This omission is consequential. A quarter century after Putnam (2000) documented the broad decline of associational life in </w:t>
+        <w:t xml:space="preserve">In May 2023, the U.S. Surgeon General declared loneliness and social isolation a public health epidemic, documenting extensive consequences for mental health, physical well-being, and mortality (Office of the Surgeon General, 2023). Yet while the health effects of social disconnection have received considerable empirical attention, one domain remains underexamined: the civic consequences of social disconnection, and its effects on volunteering in specific. That omission is consequential. A quarter century after Putnam (2000) documented the broad decline of associational life in </w:t>
       </w:r>
       <w:r>
         <w:rPr>
@@ -245,7 +245,7 @@
           <w:i w:val="0"/>
           <w:sz w:val="24"/>
         </w:rPr>
-        <w:t>, emerging evidence suggests that the decline in social connection has continued—and accelerated among younger cohorts—with potential implications for the civic infrastructure that depends on volunteerism.</w:t>
+        <w:t>, emerging evidence suggests that the decline in social connection has continued, and accelerated among younger cohorts, with potential implications for the civic infrastructure that depends on volunteerism.</w:t>
       </w:r>
     </w:p>
     <w:p>
@@ -261,7 +261,7 @@
           <w:i w:val="0"/>
           <w:sz w:val="24"/>
         </w:rPr>
-        <w:t>The scale of the volunteering decline is substantial. Between 2005 and 2015, the U.S. formal volunteering rate fell from 28.8% to 24.9%, and by 2021 it had dropped to 23.2%—the lowest rate recorded since the Bureau of Labor Statistics began tracking the measure (AmeriCorps, 2022). Among 16-to-24-year-olds, the decline has been even steeper: volunteering in this age group fell by nearly a third over the same period, from 26.4% to 17.4%. These declines have occurred despite expansions in national service programs, campus volunteer centers, and corporate volunteer initiatives—raising the possibility that the dominant recruitment strategies are failing to reach the cohorts most at risk of disengagement. The paradox is notable: the infrastructure for volunteering has expanded—with service-learning requirements in high schools, campus volunteer centers, and corporate social responsibility programs all proliferating—yet the actual rate of volunteering has declined, particularly among the youngest adults. If supply-side interventions were sufficient, rates should have stabilized or increased. They did not, suggesting that the barrier lies not in the availability of opportunities but in the social pathways through which individuals are recruited into them.</w:t>
+        <w:t>The scale of the volunteering decline is substantial. Between 2005 and 2015, the U.S. formal volunteering rate fell from 28.8% to 24.9%, and by 2021 it had dropped to 23.2%, the lowest rate recorded since the Bureau of Labor Statistics began tracking the measure (AmeriCorps, 2022). Among 16-to-24-year-olds, the decline has been even steeper: volunteering in this age group fell by nearly a third over the same period, from 26.4% to 17.4%. These declines have occurred despite expansions in national service programs, campus volunteer centers, and corporate volunteer initiatives, raising the possibility that dominant recruitment strategies are failing to reach the cohorts most at risk of disengagement. The paradox is worth pausing over: the infrastructure for volunteering has expanded (service-learning requirements in high schools, campus volunteer centers, and corporate social responsibility programs have all proliferated), yet the actual rate of volunteering has declined, most sharply among the youngest adults. If supply-side interventions were sufficient, rates should have stabilized or increased. They did not. The barrier lies not in the availability of opportunities but in the social pathways through which individuals are recruited into them.</w:t>
       </w:r>
     </w:p>
     <w:p>
@@ -277,7 +277,7 @@
           <w:i w:val="0"/>
           <w:sz w:val="24"/>
         </w:rPr>
-        <w:t>Twenge et al. (2019) documented that in-person social interaction among U.S. adolescents declined substantially between 2003 and 2017, a trend that predates the COVID-19 pandemic and thus cannot be attributed solely to lockdown-era disruptions. If social interaction is a facilitator of civic recruitment, as both social capital theory (Putnam, 2000) and the civic voluntarism model (Verba et al., 1995) suggest, then generational declines in face-to-face socialization may be associated with lower volunteering rates in ways that existing interventions fail to address. The pathway from socialization to volunteering is not abstract: an acquaintance at a community event mentions that a local food bank needs Saturday morning help; a coworker invites a colleague to a park cleanup; a neighbor asks for company at a fundraising walk. These are the mundane, low-threshold encounters through which civic recruitment historically occurs—and they require physical co-presence.</w:t>
+        <w:t>Twenge et al. (2019) documented that in-person social interaction among U.S. adolescents declined substantially between 2003 and 2017, a trend that predates the COVID-19 pandemic and thus cannot be attributed solely to lockdown-era disruptions. If social interaction drives civic recruitment, as both social capital theory (Putnam, 2000) and the civic voluntarism model (Verba et al., 1995) suggest, then generational declines in face-to-face socialization may be associated with lower volunteering rates in ways that existing interventions fail to address. The pathway from socialization to volunteering is not abstract: an acquaintance at a community event mentions that a local food bank needs Saturday morning help; a coworker invites a colleague to a park cleanup; a neighbor asks for company at a fundraising walk. These are the mundane, low-threshold encounters through which civic recruitment historically occurs, and they require physical co-presence.</w:t>
       </w:r>
     </w:p>
     <w:p>
@@ -293,7 +293,7 @@
           <w:i w:val="0"/>
           <w:sz w:val="24"/>
         </w:rPr>
-        <w:t xml:space="preserve">Understanding the civic consequences of social isolation is particularly urgent for the volunteering sector. Unlike voting, which requires a single act on a designated day, or charitable giving, which demands only a financial transaction, organized volunteering requires sustained investment of time and coordination with others—features that make it especially dependent on social networks and in-person contact (Cacioppo &amp; Cacioppo, 2014; Holt-Lunstad et al., 2010). The temporal demands of volunteering—showing up at a specific place, at a specific time, often repeatedly—create entry barriers that social connection helps overcome. A would-be volunteer who lacks social contacts within an organization faces not only logistical uncertainty but the social discomfort of entering an unfamiliar setting alone. Social connections reduce these barriers by providing both practical information and the social accompaniment that lowers the threshold for initial participation. These facilitating functions are largely invisible in survey research that treats socialization as a background variable. Yet the empirical literature on volunteering has treated social isolation primarily as a control variable rather than a central mechanism, and existing research on generational differences tends to rely on simple cohort comparisons without examining how the </w:t>
+        <w:t xml:space="preserve">Understanding the civic consequences of social isolation is urgent for the volunteering sector above all. Unlike voting, which requires a single act on a designated day, or charitable giving, which demands only a financial transaction, organized volunteering requires sustained investment of time and coordination with others. These features make it especially dependent on social networks and in-person contact (Cacioppo &amp; Cacioppo, 2014; Holt-Lunstad et al., 2010). The temporal demands of volunteering (showing up at a specific place, at a specific time, often repeatedly) create entry barriers that social connection helps overcome. A would-be volunteer who lacks social contacts within an organization faces not only logistical uncertainty but the social discomfort of entering an unfamiliar setting alone. Social connections reduce these barriers by providing both practical information and the social accompaniment that lowers the threshold for initial participation. These recruitment functions are largely invisible in survey research that treats socialization as a background variable. Yet the empirical literature on volunteering has treated social isolation primarily as a control variable rather than a central mechanism, and existing research on generational differences tends to rely on simple cohort comparisons without examining how the </w:t>
       </w:r>
       <w:r>
         <w:rPr>
@@ -311,7 +311,7 @@
           <w:i w:val="0"/>
           <w:sz w:val="24"/>
         </w:rPr>
-        <w:t xml:space="preserve"> driving volunteering may differ across generations. Wilson (2012), in a comprehensive review, identified social networks as a consistent predictor of volunteering but noted that the field lacks a clear account of how network effects vary across demographic subgroups—a gap that has only widened as the social landscape has shifted beneath younger cohorts. This leaves a critical question unanswered: Is the decline in youth volunteering better explained by changing values and attitudes, or by the weakening of the social connections associated with volunteering participation?</w:t>
+        <w:t xml:space="preserve"> driving volunteering may differ across generations. Wilson (2012), in a comprehensive review, identified social networks as a consistent predictor of volunteering but noted that the field lacks a clear account of how network effects vary across demographic subgroups, a gap that has only widened as the social landscape has shifted beneath younger cohorts. The question that remains is whether the decline in youth volunteering is better explained by changing values and attitudes or by the weakening of the social connections associated with volunteering participation.</w:t>
       </w:r>
     </w:p>
     <w:p>
@@ -327,7 +327,7 @@
           <w:i w:val="0"/>
           <w:sz w:val="24"/>
         </w:rPr>
-        <w:t xml:space="preserve">The present study addresses this gap using four waves of nationally representative CPS-CEV data (2017, 2019, 2021, 2023; </w:t>
+        <w:t xml:space="preserve">We address this gap using four waves of nationally representative CPS-CEV data (2017, 2019, 2021, 2023; </w:t>
       </w:r>
       <w:r>
         <w:rPr>
@@ -345,7 +345,7 @@
           <w:i w:val="0"/>
           <w:sz w:val="24"/>
         </w:rPr>
-        <w:t xml:space="preserve"> ≈ 201,000) to examine the association between in-person socialization frequency and volunteering across five generational cohorts. Two research questions guide the analysis, spanning variable-centered and person-centered approaches (see Purpose and Research Questions). By bracketing the COVID-19 pandemic, the four-wave design distinguishes stable cohort effects from pandemic-specific disruptions—a critical distinction that single-wave analyses cannot make. The sample size (</w:t>
+        <w:t xml:space="preserve"> ≈ 201,000) to examine the association between in-person socialization frequency and volunteering across five generational cohorts. Two research questions guide the analysis, spanning variable-centered and person-centered approaches (see Purpose and Research Questions). By bracketing the COVID-19 pandemic, the four-wave design distinguishes stable cohort effects from pandemic-specific disruptions, a critical distinction that single-wave analyses cannot make. The sample size (</w:t>
       </w:r>
       <w:r>
         <w:rPr>
@@ -363,7 +363,7 @@
           <w:i w:val="0"/>
           <w:sz w:val="24"/>
         </w:rPr>
-        <w:t xml:space="preserve"> ≈ 201,000) provides sufficient statistical power for subgroup analyses that smaller surveys cannot support—including the detection of nonlinear threshold effects within individual generational cohorts. The integrated approach—combining survey-weighted logistic regression and Latent Profile Analysis—extends the Surgeon General's health-focused framing to a civic engagement context, testing whether social isolation functions as a barrier to civic participation and whether the socialization–volunteering relationship operates differently for the most socially disconnected generation. This study contributes to the volunteering literature in two ways. First, it identifies a "First Step Effect" in which the transition from complete social isolation to minimal contact is associated with the largest marginal gain in volunteering probability—a finding with direct implications for low-threshold intervention design. Second, it documents a Gen Z-specific ceiling in which additional socialization beyond moderate levels yields no further civic return, despite Gen Z exhibiting the highest baseline volunteering probability at zero socialization—a pattern inconsistent with a motivational deficit account and more consistent with structural social disconnection.</w:t>
+        <w:t xml:space="preserve"> ≈ 201,000) provides sufficient statistical power for subgroup analyses that smaller surveys cannot support, including the detection of nonlinear threshold effects within individual generational cohorts. The integrated approach, combining survey-weighted logistic regression and Latent Profile Analysis, extends the Surgeon General's health-focused framing to a civic engagement context, testing whether social isolation functions as a barrier to civic participation and whether the socialization–volunteering relationship operates differently for the most socially disconnected generation. The analysis reveals what we call a "First Step Effect": the transition from complete social isolation to minimal contact is associated with the largest marginal gain in volunteering probability, a finding with direct implications for low-threshold intervention design. It also documents a Gen Z-specific ceiling in which additional socialization beyond moderate levels yields no further civic return, despite Gen Z exhibiting the highest baseline volunteering probability at zero socialization (a pattern inconsistent with a motivational deficit account and more consistent with structural social disconnection).</w:t>
       </w:r>
     </w:p>
     <w:p>
@@ -409,7 +409,7 @@
           <w:i w:val="0"/>
           <w:sz w:val="24"/>
         </w:rPr>
-        <w:t>The theoretical foundation for the relationship between social interaction and volunteering rests on social capital theory and the civic voluntarism model. Putnam (2000) defined social capital as the networks, norms, and trust that facilitate coordination and cooperation among individuals. In his framework, face-to-face social interaction is not merely a correlate of civic engagement but a generative mechanism: repeated contact builds the trust and reciprocity norms that lower the costs of collective action. Granovetter's (1973) weak ties theory extends this insight by arguing that peripheral social contacts—acquaintances encountered through occasional socialization—serve as bridges to new information and opportunities, including awareness of volunteer organizations and direct recruitment appeals. The mechanism is not merely informational but motivational: a personal request to volunteer from someone known face-to-face carries social weight that an impersonal announcement, whether posted on a bulletin board or shared on social media, does not. The CVM identifies such direct requests as the most proximate predictor of volunteering participation (Brady et al., 1995).</w:t>
+        <w:t>Why does face-to-face contact predict civic participation? Social capital theory and the civic voluntarism model offer complementary answers. Putnam (2000) defined social capital as the networks, norms, and trust that enable coordination and cooperation among individuals. In his framework, face-to-face social interaction is more than a correlate of civic engagement; it is a generative mechanism. Repeated contact builds the trust and reciprocity norms that lower the costs of collective action. Granovetter's (1973) weak ties theory extends this insight by arguing that peripheral social contacts (acquaintances encountered through occasional socialization) serve as bridges to new information and opportunities, including awareness of volunteer organizations and direct recruitment appeals. The mechanism is as much motivational as informational: a personal request to volunteer from someone known face-to-face carries social weight that an impersonal announcement, whether posted on a bulletin board or shared on social media, does not. The CVM identifies such direct requests as the most proximate predictor of volunteering participation (Brady et al., 1995).</w:t>
       </w:r>
     </w:p>
     <w:p>
@@ -425,7 +425,7 @@
           <w:i w:val="0"/>
           <w:sz w:val="24"/>
         </w:rPr>
-        <w:t>The civic voluntarism model (CVM) identifies three categories of factors predicting civic participation: resources (time, money, civic skills), engagement (political interest, civic duty), and recruitment networks (Brady et al., 1995; Verba et al., 1995). The recruitment pathway is particularly relevant: individuals who socialize more frequently are more likely to encounter direct requests to volunteer, which the CVM identifies as the most proximate predictor of participation. Coleman (1988) further emphasized that social capital is embedded in the structure of relationships: closed social networks with dense interconnections facilitate the emergence of norms and sanctions that encourage prosocial behavior, including volunteering. Beyerlein and Hipp (2006) demonstrated empirically that organizational membership mediates much of the socialization–volunteering pathway, suggesting that social contact facilitates volunteering partly through institutional embeddedness rather than through social influence alone. The implication is that socialization may be a necessary but not sufficient condition for civic participation: frequent social contact that occurs outside institutionally anchored contexts may not generate the recruitment exposures that translate contact into voluntarism.</w:t>
+        <w:t>Verba et al.'s (1995) civic voluntarism model (CVM) identifies three categories of factors predicting civic participation: resources (time, money, civic skills), engagement (political interest, civic duty), and recruitment networks (Brady et al., 1995). Of these, the recruitment pathway matters most here: individuals who socialize more frequently are more likely to encounter direct requests to volunteer, which the CVM identifies as the most proximate predictor of participation. Coleman (1988) further emphasized that social capital is embedded in the structure of relationships: closed social networks with dense interconnections give rise to norms and sanctions that encourage prosocial behavior, including volunteering. Beyerlein and Hipp (2006) demonstrated empirically that organizational membership mediates much of the socialization–volunteering pathway, evidence that social contact promotes volunteering partly through institutional embeddedness rather than through social influence alone. The implication is that socialization may be a necessary but not sufficient condition for civic participation: frequent social contact that occurs outside institutionally anchored contexts may not generate the recruitment exposures that translate contact into voluntarism.</w:t>
       </w:r>
     </w:p>
     <w:p>
@@ -456,7 +456,7 @@
           <w:i w:val="0"/>
           <w:sz w:val="24"/>
         </w:rPr>
-        <w:t>The theoretical expectation that social interaction facilitates civic engagement must be situated within evidence of dramatic generational shifts in socialization patterns. Twenge et al. (2019) documented that in-person social interaction among U.S. adolescents declined by approximately 30% between 2003 and 2017, a trend driven primarily by the displacement of face-to-face contact by digital communication. By 2017, the average American teenager spent more than six hours per day on screen-based media; time spent with friends in person dropped to its lowest level since measurement began (Twenge, 2017). Twenge termed the post-1995 birth cohort "iGen" and documented widespread increases in loneliness, social isolation, and mental health challenges that emerged before—not as a consequence of—the COVID-19 pandemic. The result is a generation that came of age in an environment where social connection increasingly occurs through screens rather than in the shared physical spaces—Oldenburg's (1999) "third places"—that historically served as incubators for civic recruitment.</w:t>
+        <w:t>Situating these expectations against empirical reality requires confronting dramatic generational shifts in socialization patterns. Twenge et al. (2019) documented that in-person social interaction among U.S. adolescents declined by approximately 30% between 2003 and 2017, a trend driven primarily by the displacement of face-to-face contact by digital communication. By 2017, the average American teenager spent more than six hours per day on screen-based media; time spent with friends in person dropped to its lowest level since measurement began (Twenge, 2017). Twenge termed the post-1995 birth cohort "iGen" and documented widespread increases in loneliness, social isolation, and mental health challenges that emerged before, not as a consequence of, the COVID-19 pandemic. The result is a generation that came of age in an environment where social connection increasingly occurs through screens rather than in the shared physical spaces (Oldenburg's [1999] "third places") that historically served as incubators for civic recruitment.</w:t>
       </w:r>
     </w:p>
     <w:p>
@@ -472,7 +472,7 @@
           <w:i w:val="0"/>
           <w:sz w:val="24"/>
         </w:rPr>
-        <w:t>These shifts intersect with broader transformations in civic engagement documented by scholars of political participation. Zukin et al. (2006) identified generational differences in civic participation, with younger Americans more likely to engage in individualized political consumption (boycotting, "buycotting") and less likely to participate in traditional institutional forms such as voting and formal volunteerism. Dalton (2008) proposed that this represents not disengagement but a shift from "duty-based" to "engaged" citizenship, where younger cohorts pursue civic goals through informal, often digital, channels. However, Flanagan and Levine (2010) and Wray-Lake and Hart (2012) documented that these alternative forms of engagement have not compensated for declines in traditional civic participation, particularly volunteering, among younger cohorts. If Dalton's "engaged citizenship" thesis were correct—if young people were simply channeling civic energy into new forms—aggregate civic participation should remain stable or rise even as traditional forms decline. It has not. The decline in formal volunteering among young adults has proceeded without a corresponding increase in measurable alternative engagement, suggesting that the issue may be less about shifting civic preferences and more about eroding civic infrastructure.</w:t>
+        <w:t>Socialization shifts of this magnitude intersect with broader transformations in civic engagement documented by scholars of political participation. Zukin et al. (2006) identified generational differences in civic participation, with younger Americans more likely to engage in individualized political consumption (boycotting, "buycotting") and less likely to participate in traditional institutional forms such as voting and formal volunteerism. Dalton (2008) proposed that this represents not disengagement but a shift from "duty-based" to "engaged" citizenship, where younger cohorts pursue civic goals through informal, often digital, channels. However, Flanagan and Levine (2010) and Wray-Lake and Hart (2012) documented that these alternative forms of engagement have not compensated for declines in traditional civic participation, above all volunteering, among younger cohorts. If Dalton's "engaged citizenship" thesis were correct, if young people were simply channeling civic energy into new forms, aggregate civic participation should remain stable or rise even as traditional forms decline. It has not. The decline in formal volunteering among young adults has proceeded without a corresponding increase in measurable alternative engagement, which points to eroding civic infrastructure rather than shifting civic preferences as the more likely explanation.</w:t>
       </w:r>
     </w:p>
     <w:p>
@@ -488,7 +488,7 @@
           <w:i w:val="0"/>
           <w:sz w:val="24"/>
         </w:rPr>
-        <w:t>These theoretical perspectives generate competing predictions about the relationship between social isolation and volunteering across generations. If social capital theory is correct that face-to-face interaction is the primary mechanism through which civic recruitment occurs, then the dramatic decline in in-person socialization among Gen Z should produce a correspondingly large decline in volunteering—even after controlling for the traditional predictors emphasized by the CVM (education, income, civic skills). Alternatively, if digital communication has functionally replaced face-to-face contact as a recruitment channel, then the socialization–volunteering link should be weaker for digitally native cohorts.</w:t>
+        <w:t>Together, these perspectives generate competing predictions about the relationship between social isolation and volunteering across generations. If social capital theory is correct that face-to-face interaction is the primary mechanism through which civic recruitment occurs, then the dramatic decline in in-person socialization among Gen Z should produce a correspondingly large decline in volunteering, even after controlling for the traditional predictors emphasized by the CVM (education, income, civic skills). Alternatively, if digital communication has functionally replaced face-to-face contact as a recruitment channel, then the socialization–volunteering link should be weaker for digitally native cohorts.</w:t>
       </w:r>
     </w:p>
     <w:p>
@@ -519,7 +519,7 @@
           <w:i w:val="0"/>
           <w:sz w:val="24"/>
         </w:rPr>
-        <w:t>Gen Z (born after 1997) is the focal cohort because it is the first generation to have entered adulthood entirely within a digitally mediated social environment, where the in-person settings that historically exposed young people to civic recruitment—after-school hangouts, religious youth groups, community events—have been partially displaced by screen-based interaction (Pew Research Center, 2018). CPS-CEV data consistently show that Gen Z reports the highest rates of minimal socialization, making this cohort a critical test case for whether online interaction can substitute for face-to-face contact in facilitating civic participation. Generation is operationalized as a moderating variable because generational membership captures shared formative experiences that shape how individuals relate to civic institutions (Hooghe, 2012; Kelle et al., 2025).</w:t>
+        <w:t>We focus on Gen Z (born after 1997) because it is the first generation to have entered adulthood entirely within a digitally mediated social environment, where the in-person settings that historically exposed young people to civic recruitment (after-school hangouts, religious youth groups, community events) have been partially displaced by screen-based interaction (Pew Research Center, 2018). CPS-CEV data consistently show that Gen Z reports the highest rates of minimal socialization, making this cohort a critical test case for whether online interaction can substitute for face-to-face contact in generating civic participation. Generation is operationalized as a moderating variable because generational membership captures shared formative experiences that shape how individuals relate to civic institutions (Hooghe, 2012; Kelle et al., 2025).</w:t>
       </w:r>
     </w:p>
     <w:p>
@@ -550,7 +550,7 @@
           <w:i w:val="0"/>
           <w:sz w:val="24"/>
         </w:rPr>
-        <w:t>The CVM identifies education and employment as primary resource predictors of civic participation (Verba et al., 1995; Wilson, 2012). However, whether these pathways operate with equal strength across generational cohorts has received limited attention. The resource model implicitly assumes that education and employment generate social contacts that serve as recruitment channels—an assumption that may be less reliable for Gen Z, whose social connections increasingly occur through digital rather than institutional channels (Schlozman et al., 2012; Musick &amp; Wilson, 2008).</w:t>
+        <w:t>Education and employment are primary resource predictors of civic participation in the CVM framework (Verba et al., 1995; Wilson, 2012). However, whether these pathways operate with equal strength across generational cohorts has received limited attention. The resource model implicitly assumes that education and employment generate social contacts that serve as recruitment channels, an assumption that may be less reliable for Gen Z, whose social connections increasingly occur through digital rather than institutional channels (Schlozman et al., 2012; Musick &amp; Wilson, 2008).</w:t>
       </w:r>
     </w:p>
     <w:p>
@@ -566,7 +566,7 @@
           <w:i w:val="0"/>
           <w:sz w:val="24"/>
         </w:rPr>
-        <w:t>We additionally examine civic social media use as a potential moderator. Bennett and Segerberg's (2012) "connective action" framework and the "digital compensation" hypothesis (Norris, 2002) suggest that online civic engagement could partially offset the volunteering deficit associated with social isolation, particularly for digitally native cohorts.</w:t>
+        <w:t>We also examine civic social media use as a potential moderator. Bennett and Segerberg's (2012) "connective action" framework and the "digital compensation" hypothesis (Norris, 2002) raise the possibility that online civic engagement could partially offset the volunteering deficit associated with social isolation, among digitally native cohorts especially.</w:t>
       </w:r>
     </w:p>
     <w:p>
@@ -597,7 +597,7 @@
           <w:i w:val="0"/>
           <w:sz w:val="24"/>
         </w:rPr>
-        <w:t>The Surgeon General's 2023 advisory noted that social isolation "undermines the social infrastructure on which democratic participation depends" (Office of the Surgeon General, 2023)—a claim that has received limited empirical testing in the volunteering context. Cacioppo and Cacioppo (2014) provided a theoretical bridge: their model argues that perceived social isolation triggers a self-reinforcing cycle of social withdrawal, hypervigilance to social threat, and reduced interpersonal trust. In civic terms, the most isolated individuals are the least likely to encounter the recruitment appeals that social capital theory identifies as the primary mechanism for volunteering initiation. This account predicts a nonlinear relationship: even small reductions in isolation may break the withdrawal cycle and yield disproportionate gains in civic participation—the "First Step Effect" hypothesis tested in this study.</w:t>
+        <w:t>In 2023, the Surgeon General's advisory noted that social isolation "undermines the social infrastructure on which democratic participation depends" (Office of the Surgeon General, 2023), a claim that has received limited empirical testing in the volunteering context. Cacioppo and Cacioppo (2014) provided a theoretical bridge: their model argues that perceived social isolation triggers a self-reinforcing cycle of social withdrawal, hypervigilance to social threat, and reduced interpersonal trust. In civic terms, the most isolated individuals are the least likely to encounter the recruitment appeals that social capital theory identifies as the primary mechanism for volunteering initiation. The prediction is nonlinear. Even small reductions in isolation may break the withdrawal cycle and yield disproportionate gains in civic participation, the "First Step Effect" hypothesis tested in this study.</w:t>
       </w:r>
     </w:p>
     <w:p>
@@ -628,7 +628,7 @@
           <w:i w:val="0"/>
           <w:sz w:val="24"/>
         </w:rPr>
-        <w:t>The purpose of this study is to examine the association between in-person socialization frequency and volunteering across generational cohorts using four waves of nationally representative data from the Current Population Survey Civic Engagement and Volunteering Supplement (2017, 2019, 2021, 2023). We employ an integrated design that combines variable-centered regression and person-centered profiling to provide methodological triangulation. By spanning four waves that bracket the COVID-19 pandemic, this design allows us to distinguish structural cohort effects from pandemic-specific disruptions.</w:t>
+        <w:t>This study examines the association between in-person socialization frequency and volunteering across generational cohorts using four waves of nationally representative data from the Current Population Survey Civic Engagement and Volunteering Supplement (2017, 2019, 2021, 2023). We employ an integrated design that combines variable-centered regression and person-centered profiling to provide methodological triangulation. By spanning four waves that bracket the COVID-19 pandemic, this design allows us to distinguish structural cohort effects from pandemic-specific disruptions.</w:t>
       </w:r>
     </w:p>
     <w:p>
@@ -1284,122 +1284,7 @@
           <w:i w:val="0"/>
           <w:sz w:val="24"/>
         </w:rPr>
-        <w:t>Six indicators were used to construct civic engagement typologies:</w:t>
-      </w:r>
-    </w:p>
-    <w:p>
-      <w:pPr>
-        <w:spacing w:before="0" w:after="0" w:lineRule="auto" w:line="480"/>
-        <w:ind w:firstLine="720"/>
-        <w:jc w:val="left"/>
-      </w:pPr>
-      <w:r>
-        <w:rPr>
-          <w:rFonts w:ascii="Times New Roman" w:hAnsi="Times New Roman" w:cs="Times New Roman"/>
-          <w:b/>
-          <w:i w:val="0"/>
-          <w:sz w:val="24"/>
-        </w:rPr>
-        <w:t>Boycotting</w:t>
-      </w:r>
-      <w:r>
-        <w:rPr>
-          <w:rFonts w:ascii="Times New Roman" w:hAnsi="Times New Roman" w:cs="Times New Roman"/>
-          <w:b w:val="0"/>
-          <w:i w:val="0"/>
-          <w:sz w:val="24"/>
-        </w:rPr>
-        <w:t xml:space="preserve"> (CEBOYCOTT): Whether the respondent boycotted a product for social or political reasons (binary). </w:t>
-      </w:r>
-      <w:r>
-        <w:rPr>
-          <w:rFonts w:ascii="Times New Roman" w:hAnsi="Times New Roman" w:cs="Times New Roman"/>
-          <w:b/>
-          <w:i w:val="0"/>
-          <w:sz w:val="24"/>
-        </w:rPr>
-        <w:t>Contacting officials</w:t>
-      </w:r>
-      <w:r>
-        <w:rPr>
-          <w:rFonts w:ascii="Times New Roman" w:hAnsi="Times New Roman" w:cs="Times New Roman"/>
-          <w:b w:val="0"/>
-          <w:i w:val="0"/>
-          <w:sz w:val="24"/>
-        </w:rPr>
-        <w:t xml:space="preserve"> (CEPUBOFF): Whether the respondent contacted a public official (binary). </w:t>
-      </w:r>
-      <w:r>
-        <w:rPr>
-          <w:rFonts w:ascii="Times New Roman" w:hAnsi="Times New Roman" w:cs="Times New Roman"/>
-          <w:b/>
-          <w:i w:val="0"/>
-          <w:sz w:val="24"/>
-        </w:rPr>
-        <w:t>Political conversation</w:t>
-      </w:r>
-      <w:r>
-        <w:rPr>
-          <w:rFonts w:ascii="Times New Roman" w:hAnsi="Times New Roman" w:cs="Times New Roman"/>
-          <w:b w:val="0"/>
-          <w:i w:val="0"/>
-          <w:sz w:val="24"/>
-        </w:rPr>
-        <w:t xml:space="preserve"> (CEPOLCONV): Frequency of discussing politics (ordinal, 1–6). </w:t>
-      </w:r>
-      <w:r>
-        <w:rPr>
-          <w:rFonts w:ascii="Times New Roman" w:hAnsi="Times New Roman" w:cs="Times New Roman"/>
-          <w:b/>
-          <w:i w:val="0"/>
-          <w:sz w:val="24"/>
-        </w:rPr>
-        <w:t>In-person socialization</w:t>
-      </w:r>
-      <w:r>
-        <w:rPr>
-          <w:rFonts w:ascii="Times New Roman" w:hAnsi="Times New Roman" w:cs="Times New Roman"/>
-          <w:b w:val="0"/>
-          <w:i w:val="0"/>
-          <w:sz w:val="24"/>
-        </w:rPr>
-        <w:t xml:space="preserve"> (CESOCIALIZE): Frequency of in-person social contact (ordinal, 1–6). </w:t>
-      </w:r>
-      <w:r>
-        <w:rPr>
-          <w:rFonts w:ascii="Times New Roman" w:hAnsi="Times New Roman" w:cs="Times New Roman"/>
-          <w:b/>
-          <w:i w:val="0"/>
-          <w:sz w:val="24"/>
-        </w:rPr>
-        <w:t>Organizational membership</w:t>
-      </w:r>
-      <w:r>
-        <w:rPr>
-          <w:rFonts w:ascii="Times New Roman" w:hAnsi="Times New Roman" w:cs="Times New Roman"/>
-          <w:b w:val="0"/>
-          <w:i w:val="0"/>
-          <w:sz w:val="24"/>
-        </w:rPr>
-        <w:t xml:space="preserve"> (VLMEMBERN): Number of organizations to which the respondent belongs (count; respondents reporting no membership via VLMEMBER were coded as 0). </w:t>
-      </w:r>
-      <w:r>
-        <w:rPr>
-          <w:rFonts w:ascii="Times New Roman" w:hAnsi="Times New Roman" w:cs="Times New Roman"/>
-          <w:b/>
-          <w:i w:val="0"/>
-          <w:sz w:val="24"/>
-        </w:rPr>
-        <w:t>Charitable donation</w:t>
-      </w:r>
-      <w:r>
-        <w:rPr>
-          <w:rFonts w:ascii="Times New Roman" w:hAnsi="Times New Roman" w:cs="Times New Roman"/>
-          <w:b w:val="0"/>
-          <w:i w:val="0"/>
-          <w:sz w:val="24"/>
-        </w:rPr>
-        <w:t xml:space="preserve"> (VLDONATE): Whether the respondent donated to a charitable or religious organization (binary).</w:t>
+        <w:t>Six indicators were used to construct civic engagement typologies. Three are binary: boycotting a product for social or political reasons (CEBOYCOTT), contacting a public official (CEPUBOFF), and donating to a charitable or religious organization (VLDONATE). Two are ordinal (scaled 1–6): frequency of discussing politics (CEPOLCONV) and frequency of in-person social contact (CESOCIALIZE). The sixth, organizational membership (VLMEMBERN), is a count of the number of organizations to which the respondent belongs (respondents reporting no membership via VLMEMBER were coded as 0).</w:t>
       </w:r>
     </w:p>
     <w:p>
@@ -1415,7 +1300,7 @@
           <w:i w:val="0"/>
           <w:sz w:val="24"/>
         </w:rPr>
-        <w:t>All six indicators are available across all four survey waves with approximately 94% valid response rates. This set captures multiple dimensions of civic life—political action, social connection, institutional membership, and philanthropic behavior—enabling person-centered identification of distinct engagement patterns.</w:t>
+        <w:t>All six indicators are available across all four survey waves with approximately 94% valid response rates. Together, these indicators span multiple dimensions of civic life (political action, social connection, institutional membership, and philanthropic behavior), enabling person-centered identification of distinct engagement patterns.</w:t>
       </w:r>
     </w:p>
     <w:p>
@@ -1617,7 +1502,7 @@
           <w:i w:val="0"/>
           <w:sz w:val="24"/>
         </w:rPr>
-        <w:t>Three sets of robustness analyses tested the sensitivity of the regression findings. First, we compared the observed categorical AMEs to predictions from a smooth log-linear specification to confirm that the First Step Effect reflects a genuine threshold rather than an artifact of scale concavity. Second, we added organizational membership (VLMEMBERN) as a covariate to assess the extent to which the socialization pathway operates through institutional embeddedness. Third, we included a nonlinear age control (age-squared) alongside the generation variable to provide partial leverage against age-cohort confounding.</w:t>
+        <w:t>We conducted three robustness analyses to test the sensitivity of the regression findings. To confirm that the First Step Effect reflects a genuine threshold rather than an artifact of scale concavity, we compared the observed categorical AMEs to predictions from a smooth log-linear specification. We also added organizational membership (VLMEMBERN) as a covariate to assess whether the socialization pathway operates through institutional embeddedness. A nonlinear age control (age-squared) was included alongside the generation variable to provide partial leverage against age-cohort confounding.</w:t>
       </w:r>
     </w:p>
     <w:p>
@@ -1648,7 +1533,7 @@
           <w:i w:val="0"/>
           <w:sz w:val="24"/>
         </w:rPr>
-        <w:t>The analytic sample comprised 201,168 respondents pooled across four CPS-CEV waves (2017, 2019, 2021, 2023), with an overall volunteering rate of 32.0%. Table 1 reports sample characteristics. Gen Z respondents (</w:t>
+        <w:t>Pooled across four CPS-CEV waves (2017, 2019, 2021, 2023), the analytic sample comprised 201,168 respondents with an overall volunteering rate of 32.0%. Table 1 reports sample characteristics. Gen Z respondents (</w:t>
       </w:r>
       <w:r>
         <w:rPr>
@@ -1666,7 +1551,7 @@
           <w:i w:val="0"/>
           <w:sz w:val="24"/>
         </w:rPr>
-        <w:t xml:space="preserve"> = 11,038) were youngest (M = 21.1 years), least educated (14.3% BA+), and least married (9.6%). The socialization gradient was steep: nearly half of Gen Z respondents (46.3%) reported socializing no more than a few times per year, compared with 19.0% of Boomers—a rate that was stable across all four waves (range: 44.6–47.8%), indicating that Gen Z's social disconnection preceded the COVID-19 pandemic and was independent of it. The generational contrast is not merely statistical: nearly half of the youngest adult cohort in a nationally representative sample reports that their face-to-face social contact amounts to no more than a few encounters per year—a level of isolation that, for older generations, characterizes fewer than one in five respondents.</w:t>
+        <w:t xml:space="preserve"> = 11,038) were youngest (M = 21.1 years), least educated (14.3% BA+), and least married (9.6%). The socialization gradient was steep: nearly half of Gen Z respondents (46.3%) reported socializing no more than a few times per year, compared with 19.0% of Boomers, a rate that was stable across all four waves (range: 44.6–47.8%), indicating that Gen Z's social disconnection preceded the COVID-19 pandemic and was independent of it. The generational contrast is worth spelling out: nearly half of the youngest adult cohort in a nationally representative sample reports that their face-to-face social contact amounts to no more than a few encounters per year, a level of isolation that, for older generations, characterizes fewer than one in five respondents.</w:t>
       </w:r>
     </w:p>
     <w:p>
@@ -17883,7 +17768,7 @@
           <w:i w:val="0"/>
           <w:sz w:val="24"/>
         </w:rPr>
-        <w:t>The first is a universal threshold. For every generation, the transition from no socialization to minimal socialization (a few times per year) was associated with the single largest marginal gain in volunteering probability (Table 3). This "First Step" effect ranged from 7.3 percentage points for the Silent Generation to 10.3 points for Gen X, with Gen Z at 8.1 points (95% CI [5.0, 11.2])—comparable in magnitude to the education gradient (BA+ vs. no BA). Subsequent transitions yielded progressively smaller gains, following a concave dose–response pattern: the move from isolation to minimal contact is worth roughly as much, in terms of volunteering probability, as the next three transitions combined. Across all cohorts, breaking out of complete social isolation was associated with the largest marginal civic return. Robustness analyses confirmed that this threshold is genuine: the observed categorical AMEs exceeded smooth log-linear predictions by 2.4 to 4.7 percentage points across all generations, with the excess largest for Gen Z (4.7 pp). When organizational membership was added as a covariate, the First Step Effect was attenuated by approximately 30%, indicating that part of the socialization pathway operates through institutional embeddedness—but a substantial independent association remained.</w:t>
+        <w:t>A universal threshold emerged. For every generation, the transition from no socialization to minimal socialization (a few times per year) was associated with the single largest marginal gain in volunteering probability (Table 3). This "First Step" effect ranged from 7.3 percentage points for the Silent Generation to 10.3 points for Gen X, with Gen Z at 8.1 points (95% CI [5.0, 11.2]), comparable in magnitude to the education gradient (BA+ vs. no BA). Subsequent transitions yielded progressively smaller gains, following a concave dose–response pattern: the move from isolation to minimal contact is worth roughly as much, in volunteering probability terms, as the next three transitions combined. Across all cohorts, breaking out of complete social isolation was associated with the largest marginal civic return. Robustness analyses confirmed that this threshold is genuine: the observed categorical AMEs exceeded smooth log-linear predictions by 2.4 to 4.7 percentage points across all generations, with the excess largest for Gen Z (4.7 pp). When organizational membership was added as a covariate, the First Step Effect was attenuated by approximately 30%, indicating that part of the socialization pathway operates through institutional embeddedness, but a substantial independent association remained.</w:t>
       </w:r>
     </w:p>
     <w:p>
@@ -18938,7 +18823,7 @@
           <w:i w:val="0"/>
           <w:sz w:val="24"/>
         </w:rPr>
-        <w:t>The second pattern is unique to Gen Z: a plateau. Gen Z's predicted volunteering probability rose sharply from 27.3% at no socialization to 48.4% at a few times per month, then flatlined—reaching only 50.8% at daily socialization. No other generation exhibited this ceiling. Boomers climbed continuously from 16.7% to 46.8%; Gen X showed the steepest overall gradient (22.0% to 48.1%). A striking baseline comparison deserves note: Gen Z's predicted volunteering probability at zero socialization (27.3%) exceeded that of every other generation, including Boomers (16.7%), suggesting that low volunteering rates among Gen Z do not reflect weaker civic motivation. The plateau instead suggests that for Gen Z, additional face-to-face contact beyond a moderate threshold is not associated with additional civic recruitment, possibly because the social contexts in which high-frequency Gen Z socialization occurs are decoupled from the community-based institutions that historically channel contact into voluntarism.</w:t>
+        <w:t>Gen Z deviated from this pattern with a plateau. Gen Z's predicted volunteering probability rose sharply from 27.3% at no socialization to 48.4% at a few times per month, then flatlined, reaching only 50.8% at daily socialization. No other generation exhibited this ceiling. Boomers climbed continuously from 16.7% to 46.8%; Gen X showed the steepest overall gradient (22.0% to 48.1%). A striking baseline comparison deserves note: Gen Z's predicted volunteering probability at zero socialization (27.3%) exceeded that of every other generation, including Boomers (16.7%), which argues against the idea that low volunteering rates among Gen Z reflect weaker civic motivation. The plateau points instead to a decoupling: for Gen Z, additional face-to-face contact beyond a moderate threshold is not associated with additional civic recruitment, possibly because the social contexts in which high-frequency Gen Z socialization occurs lack ties to the community-based institutions that historically channel contact into voluntarism.</w:t>
       </w:r>
     </w:p>
     <w:p>
@@ -19023,7 +18908,7 @@
           <w:i w:val="0"/>
           <w:sz w:val="24"/>
         </w:rPr>
-        <w:t xml:space="preserve"> = .969). The social media null finding is theoretically informative: it indicates that digital civic engagement does not compensate for the absence of face-to-face socialization, and it does so uniformly across generations—offering no special pathway for digitally native young adults. The near-significant employment result (</w:t>
+        <w:t xml:space="preserve"> = .969). The social media null is theoretically informative: digital civic engagement does not compensate for the absence of face-to-face socialization, and this holds uniformly across generations, offering no special pathway for digitally native young adults. The near-significant employment result (</w:t>
       </w:r>
       <w:r>
         <w:rPr>
@@ -19057,7 +18942,7 @@
           <w:i w:val="0"/>
           <w:sz w:val="24"/>
         </w:rPr>
-        <w:t>The temporal stability test was among the most consequential. The socialization × generation × post-COVID interaction was not significant (</w:t>
+        <w:t>Perhaps the most consequential test concerned temporal stability. The socialization × generation × post-COVID interaction was not significant (</w:t>
       </w:r>
       <w:r>
         <w:rPr>
@@ -19075,7 +18960,7 @@
           <w:i w:val="0"/>
           <w:sz w:val="24"/>
         </w:rPr>
-        <w:t xml:space="preserve"> = .420), confirming that the patterns documented above—including the Gen Z plateau—were present before the pandemic and unchanged afterward. The pre-COVID First Step AME for Gen Z (10.7 points, 95% CI [5.8, 15.6]) was comparable to the full-sample estimate, and the overall relationship structure was preserved across periods. This rules out the interpretation that declining youth volunteering is a pandemic artifact; it is a cohort characteristic.</w:t>
+        <w:t xml:space="preserve"> = .420), confirming that the patterns documented above (including the Gen Z plateau) were present before the pandemic and unchanged afterward. The pre-COVID First Step AME for Gen Z (10.7 points, 95% CI [5.8, 15.6]) was comparable to the full-sample estimate, and the overall relationship structure was preserved across periods. Declining youth volunteering is not a pandemic artifact; it is a cohort characteristic.</w:t>
       </w:r>
     </w:p>
     <w:p>
@@ -19106,7 +18991,7 @@
           <w:i w:val="0"/>
           <w:sz w:val="24"/>
         </w:rPr>
-        <w:t xml:space="preserve">Person-centered analysis tested whether the regression findings hold when individuals are classified by their full pattern of civic behavior rather than by individual predictors. LPA identified six distinct profiles (Tables 4–5; Figure 4). Three anchor the interpretive framework: the </w:t>
+        <w:t xml:space="preserve">We turned to person-centered analysis to test whether the regression findings hold when individuals are classified by their full pattern of civic behavior rather than by individual predictors. LPA identified six distinct profiles (Tables 4–5; Figure 4). Three anchor the interpretive framework: the </w:t>
       </w:r>
       <w:r>
         <w:rPr>
@@ -22132,7 +22017,7 @@
           <w:i w:val="0"/>
           <w:sz w:val="24"/>
         </w:rPr>
-        <w:t>The generational distribution across profiles was pronounced (Figure 3). Over a third of Gen Z (35.3%) fell into the Isolated Disengaged profile—more than double the Boomer rate (15.3%)—while only 3.7% of Gen Z reached Fully Engaged status (vs. 15.1% of Boomers). Combining the two socially isolated profiles (Isolated Disengaged and Politically Aware Isolated), over half of Gen Z (50.6%) occupied profiles defined by social disconnection. These proportions were essentially unchanged between the pre- and post-COVID periods (Isolated Disengaged: 35.5% vs. 35.2%), providing person-centered corroboration of the regression-based temporal stability finding. The concentration of Gen Z in socially disconnected profiles is striking in absolute terms: more than one in three Gen Z respondents fell into the profile defined by minimal engagement on every civic indicator—a rate suggesting that social disconnection is not a marginal phenomenon among young adults but a dominant pattern.</w:t>
+        <w:t>Generational sorting across profiles was pronounced (Figure 3). Over a third of Gen Z (35.3%) fell into the Isolated Disengaged profile, more than double the Boomer rate (15.3%), while only 3.7% of Gen Z reached Fully Engaged status (vs. 15.1% of Boomers). Combining the two socially isolated profiles (Isolated Disengaged and Politically Aware Isolated), over half of Gen Z (50.6%) occupied profiles defined by social disconnection. Profile proportions were essentially unchanged between the pre- and post-COVID periods (Isolated Disengaged: 35.5% vs. 35.2%), providing person-centered corroboration of the regression-based temporal stability finding. The concentration of Gen Z in socially disconnected profiles is striking in absolute terms: more than one in three Gen Z respondents fell into the profile defined by minimal engagement on every civic indicator, a rate consistent with social disconnection being not a marginal phenomenon among young adults but a dominant pattern.</w:t>
       </w:r>
     </w:p>
     <w:p>
@@ -22232,7 +22117,7 @@
           <w:i w:val="0"/>
           <w:sz w:val="24"/>
         </w:rPr>
-        <w:t>In-person socialization is the single strongest correlate of volunteering among the most socially disconnected generation in the CPS-CEV record—and the transition from complete isolation to even occasional contact is associated with a larger civic return than any subsequent increase in social frequency. Two complementary analytic approaches, one variable-centered and one person-centered, converge on this conclusion despite sharing neither assumptions about variable roles nor distributional requirements. That convergence matters.</w:t>
+        <w:t>In-person socialization is the single strongest correlate of volunteering among the most socially disconnected generation in the CPS-CEV record, and the transition from complete isolation to even occasional contact is associated with a larger civic return than any subsequent increase in social frequency. Two complementary analytic approaches (one variable-centered, one person-centered) converge on this conclusion despite sharing neither assumptions about variable roles nor distributional requirements. That convergence matters.</w:t>
       </w:r>
     </w:p>
     <w:p>
@@ -22248,7 +22133,7 @@
           <w:i w:val="0"/>
           <w:sz w:val="24"/>
         </w:rPr>
-        <w:t>Consider a finding that did not have to turn out this way: Gen Z's predicted volunteering probability at zero socialization (27.3%) exceeded that of every older cohort, including Boomers (16.7%). If declining youth volunteering reflected weakened civic motivation, one would expect lower baseline rates, not higher ones. Gen Z appears more civically inclined at the individual level but less able to convert that inclination into sustained participation. The puzzle, then, is not whether young adults care about their communities—the baseline rates say they do—but why additional social contact fails to recruit them the way it recruits everyone else.</w:t>
+        <w:t>Consider a finding that did not have to turn out this way: Gen Z's predicted volunteering probability at zero socialization (27.3%) exceeded that of every older cohort, including Boomers (16.7%). If declining youth volunteering reflected weakened civic motivation, we would expect lower baseline rates, not higher ones. Gen Z appears more civically inclined at the individual level but less able to convert that inclination into sustained participation. The puzzle, then, is not whether young adults care about their communities (the baseline rates say they do) but why additional social contact fails to recruit them the way it recruits everyone else.</w:t>
       </w:r>
     </w:p>
     <w:p>
@@ -22264,7 +22149,7 @@
           <w:i w:val="0"/>
           <w:sz w:val="24"/>
         </w:rPr>
-        <w:t>Cacioppo and Cacioppo's (2014) theorized cycle of social withdrawal predicts that even minimal social contact should disrupt the self-reinforcing dynamic of isolation and perceived social threat, yielding disproportionate gains at the lowest end of the socialization continuum. The First Step Effect confirms that prediction across all five generations. Beyond that initial threshold, generational trajectories diverged. Gen Z's volunteering probability plateaued at moderate socialization levels—a ceiling absent in every older cohort (see Figure 1). Putnam's (2000) social capital framework, which predicts continuous returns from accumulated contact, cannot account for this plateau. We interpret the Gen Z ceiling as reflecting a decoupling: additional face-to-face contact occurs in contexts stripped of the institutional anchoring through which civic recruitment historically operates. In Putnam's own terms, the youngest Americans are not bowling alone by choice; they are scrolling together in a digital environment that sustains the perception of connection without providing the face-to-face encounters through which civic recruitment occurs.</w:t>
+        <w:t>Cacioppo and Cacioppo's (2014) theorized cycle of social withdrawal predicts that even minimal social contact should disrupt the self-reinforcing dynamic of isolation and perceived social threat, yielding disproportionate gains at the lowest end of the socialization continuum. The First Step Effect confirms that prediction across all five generations. Beyond that initial threshold, generational trajectories diverged. Gen Z's volunteering probability plateaued at moderate socialization levels; no older cohort exhibited this ceiling (see Figure 1). Putnam's (2000) social capital framework, which predicts continuous returns from accumulated contact, cannot account for this plateau. We read the Gen Z ceiling as reflecting a decoupling: additional face-to-face contact occurs in contexts stripped of the institutional anchoring through which civic recruitment historically operates. In Putnam's own terms, the youngest Americans are not bowling alone by choice; they are scrolling together in a digital environment that sustains the perception of connection without providing the face-to-face encounters through which civic recruitment occurs.</w:t>
       </w:r>
     </w:p>
     <w:p>
@@ -22298,7 +22183,7 @@
           <w:i w:val="0"/>
           <w:sz w:val="24"/>
         </w:rPr>
-        <w:t xml:space="preserve"> = .009), but the Gen Z plateau persisted even among degree holders. The education amplification effect operated as expected for Boomers and Gen Xers—roughly 3 percentage points of additional First Step return for BA+ respondents—yet was attenuated to less than 1 point for Gen Z. Employment fell just short of conventional significance (</w:t>
+        <w:t xml:space="preserve"> = .009), but the Gen Z plateau persisted even among degree holders. For Boomers and Gen Xers, holding a BA added roughly 3 percentage points of additional First Step return; for Gen Z, the boost was less than 1 point. Employment fell just short of conventional significance (</w:t>
       </w:r>
       <w:r>
         <w:rPr>
@@ -22334,7 +22219,7 @@
           <w:i w:val="0"/>
           <w:sz w:val="24"/>
         </w:rPr>
-        <w:t xml:space="preserve"> = .969). If digital platforms sustain civic awareness, why don't they also sustain civic action? The social media null warrants emphasis: the digital compensation effect posited by Bennett and Segerberg's (2012) connective action framework does not operate differently for digitally native young adults. Online civic activity offers no special substitute for the face-to-face encounter in which someone says, "We need help Saturday morning—will you come?" That the most plausible compensatory pathways—education, employment, digital engagement—failed to budge the generational pattern is itself theoretically revealing.</w:t>
+        <w:t xml:space="preserve"> = .969). If digital platforms sustain civic awareness, why don't they also sustain civic action? The social media null deserves emphasis: the digital compensation effect posited by Bennett and Segerberg's (2012) connective action framework does not operate differently for digitally native young adults. Online civic activity offers no special substitute for the face-to-face encounter in which someone says, "We need help Saturday morning, will you come?" That the most plausible compensatory pathways (education, employment, digital engagement) all failed to budge the generational pattern is itself theoretically revealing.</w:t>
       </w:r>
     </w:p>
     <w:p>
@@ -22350,7 +22235,7 @@
           <w:i w:val="0"/>
           <w:sz w:val="24"/>
         </w:rPr>
-        <w:t>Pandemic-era disruptions do not explain the pattern either. The socialization × generation × post-COVID interaction was not significant (</w:t>
+        <w:t>Nor do pandemic-era disruptions explain the pattern. The socialization × generation × post-COVID interaction was not significant (</w:t>
       </w:r>
       <w:r>
         <w:rPr>
@@ -22368,7 +22253,7 @@
           <w:i w:val="0"/>
           <w:sz w:val="24"/>
         </w:rPr>
-        <w:t xml:space="preserve"> = .420), and the pre-COVID First Step AME for Gen Z (10.7 points) matched the full-sample estimate. Gen Z's weaker conversion of social contact into volunteering was evident before COVID-19 and unchanged afterward. Twenge et al. (2019) documented that declines in adolescent socialization were well underway by 2017; the present analysis extends that finding to its civic consequences. Pandemic recovery strategies alone will not resolve the engagement deficit among young adults—the deficit predates the pandemic. The First Step Effect also points to a practical answer: target the initial transition out of social isolation. Low-threshold, single-contact strategies should be preferred over sustained-commitment appeals. Creating one opportunity for in-person contact may matter more than intensifying recruitment among already-connected individuals, and digital-only campaigns offer no compensatory advantage (</w:t>
+        <w:t xml:space="preserve"> = .420), and the pre-COVID First Step AME for Gen Z (10.7 points) matched the full-sample estimate. Gen Z's weaker conversion of social contact into volunteering was evident before COVID-19 and unchanged afterward. Twenge et al. (2019) documented that declines in adolescent socialization were well underway by 2017; the present analysis extends that finding to its civic consequences. Pandemic recovery strategies alone will not resolve the engagement deficit among young adults; the deficit predates the pandemic. The First Step Effect also points to a practical answer: target the initial transition out of social isolation. Low-threshold, single-contact strategies should take priority over sustained-commitment appeals. Creating one opportunity for in-person contact may matter more than intensifying recruitment among already-connected individuals, and digital-only campaigns offer no compensatory advantage (</w:t>
       </w:r>
       <w:r>
         <w:rPr>
@@ -22402,7 +22287,7 @@
           <w:i w:val="0"/>
           <w:sz w:val="24"/>
         </w:rPr>
-        <w:t>Person-centered analysis told the same story through a different window. Gen Z was disproportionately concentrated in socially disconnected profiles (see Figure 3): over half (50.6%) occupied the Isolated Disengaged or Politically Aware Isolated classes, and only 3.7% reached Fully Engaged status. These proportions were essentially unchanged across the pre- and post-COVID periods, corroborating the temporal stability finding from the regression models.</w:t>
+        <w:t>Person-centered analysis told the same story through a different lens. Gen Z was disproportionately concentrated in socially disconnected profiles (see Figure 3): over half (50.6%) occupied the Isolated Disengaged or Politically Aware Isolated classes, and only 3.7% reached Fully Engaged status. Profile proportions held steady across the pre- and post-COVID periods, corroborating the temporal stability finding from the regression models.</w:t>
       </w:r>
     </w:p>
     <w:p>
@@ -22418,7 +22303,7 @@
           <w:i w:val="0"/>
           <w:sz w:val="24"/>
         </w:rPr>
-        <w:t>High socialization without institutional anchoring, it turns out, did not translate into civic action—the Socially Active Non-Donors class makes this plain. Members reported the highest socialization scores of any profile (M = 4.70) yet volunteered at only 14.6%, below the sample mean. Organizational membership was near zero (M = 0.08) and charitable giving absent. Robustness analysis confirmed the pathway: organizational membership attenuated the First Step Effect by approximately 30%, indicating that institutional embeddedness is a key mediating mechanism rather than socialization alone. Not all socializing is created equal. The distinction between bonding capital—close-knit relationships among similar individuals—and bridging capital—cross-cutting ties connecting individuals to new networks and resources—is central here (Putnam, 2000). The Socially Active Non-Donors appear rich in bonding capital but poor in the bridging capital that links individuals to civic institutions. For Gen Z, whose socialization increasingly occurs in homogeneous peer groups rather than in the institutionally diverse settings that older cohorts navigated—churches, civic associations, workplaces—this distinction may be particularly consequential. Klinenberg's (2018) concept of "social infrastructure," the physical spaces and institutions facilitating social contact, provides a framework for intervention: Cooperative Extension, embedded at the interface of campus and community, could design programming that treats social connection as a prerequisite for volunteering rather than a byproduct of it.</w:t>
+        <w:t>High socialization without institutional anchoring, it turns out, did not translate into civic action. The Socially Active Non-Donors class makes this plain. Members reported the highest socialization scores of any profile (M = 4.70) yet volunteered at only 14.6%, below the sample mean. Organizational membership was near zero (M = 0.08) and charitable giving absent. Robustness analysis confirmed the pathway: controlling for organizational membership attenuated the First Step Effect by approximately 30%, indicating that institutional embeddedness is a key mediating mechanism. Not all socializing is created equal. The distinction between bonding capital (close-knit relationships among similar individuals) and bridging capital (cross-cutting ties connecting individuals to new networks and resources) is central here (Putnam, 2000). The Socially Active Non-Donors appear rich in bonding capital but poor in the bridging capital that links individuals to civic institutions. For Gen Z, whose socialization increasingly occurs in homogeneous peer groups rather than in the institutionally diverse settings that older cohorts navigated (churches, civic associations, workplaces), this distinction may prove consequential. Klinenberg's (2018) concept of "social infrastructure" (the physical spaces and institutions that support social contact) provides a framework for intervention: Cooperative Extension, embedded at the interface of campus and community, could design programming that treats social connection as a prerequisite for volunteering rather than a byproduct of it.</w:t>
       </w:r>
     </w:p>
     <w:p>
@@ -22434,7 +22319,7 @@
           <w:i w:val="0"/>
           <w:sz w:val="24"/>
         </w:rPr>
-        <w:t>A temporal shift in profile structure deserves attention. Gen Z's representation in the Activist Boycotter profile doubled from 5.9% pre-COVID to 10.7% post-COVID, even as Isolated Disengaged proportions remained stable. The post-2020 period catalyzed a politicization pathway for a subset of Gen Z without altering the broader pattern of civic disengagement. The Activist Boycotter profile—emphasizing political consumption over institutional volunteering (volunteering rate: 46.9%)—may represent an emerging civic pathway operating alongside traditional voluntarism rather than substituting for it.</w:t>
+        <w:t>A temporal shift in profile structure deserves attention. Gen Z's representation in the Activist Boycotter profile doubled from 5.9% pre-COVID to 10.7% post-COVID, even as Isolated Disengaged proportions remained stable. The post-2020 period catalyzed a politicization pathway for a subset of Gen Z without altering the broader pattern of civic disengagement. The Activist Boycotter profile (which emphasizes political consumption over institutional volunteering, with a 46.9% volunteering rate) may represent an emerging civic pathway operating alongside traditional voluntarism rather than substituting for it.</w:t>
       </w:r>
     </w:p>
     <w:p>
@@ -22450,7 +22335,7 @@
           <w:i w:val="0"/>
           <w:sz w:val="24"/>
         </w:rPr>
-        <w:t>These findings collectively challenge the prevailing narrative about generational differences in civic engagement. Dalton (2008) and others frame declining youth participation as a value shift from "duty-based" to "engaged" citizenship, in which younger cohorts express commitment through informal and digital channels. We read the data differently. The baseline paradox—Gen Z volunteering more than similarly isolated Boomers at zero socialization—is inconsistent with a motivational deficit account. The plateau at moderate socialization levels is more consistent with an account in which Gen Z lacks the dense, multiplex social networks that Granovetter (1973) identified as conduits for weak-tie recruitment. The "scrolling together" metaphor captures this structural irony: Gen Z is the most connected generation digitally yet the most disconnected in face-to-face contact. The null finding for civic social media use (</w:t>
+        <w:t>What does this convergence of evidence mean for the prevailing narrative about generational differences in civic engagement? It challenges it. Dalton (2008) and others frame declining youth participation as a value shift from "duty-based" to "engaged" citizenship, in which younger cohorts express commitment through informal and digital channels. We read the data differently. The baseline paradox (Gen Z volunteering more than similarly isolated Boomers at zero socialization) is inconsistent with a motivational deficit account. The plateau at moderate socialization levels is more consistent with an account in which Gen Z lacks the dense, multiplex social networks that Granovetter (1973) identified as conduits for weak-tie recruitment. The "scrolling together" metaphor captures this structural irony: Gen Z is the most connected generation digitally yet the most disconnected in face-to-face contact. The null finding for civic social media use (</w:t>
       </w:r>
       <w:r>
         <w:rPr>
@@ -22468,7 +22353,7 @@
           <w:i w:val="0"/>
           <w:sz w:val="24"/>
         </w:rPr>
-        <w:t xml:space="preserve"> = .969) confirms that digital civic activity does not function as a recruitment channel the way a personal encounter does. Those who socialize enough to encounter some recruitment opportunities do volunteer, but their social contexts—often peer-group gatherings without institutional anchoring—may not provide the escalating web of obligations that drove older cohorts toward deeper engagement.</w:t>
+        <w:t xml:space="preserve"> = .969) confirms that digital civic activity does not function as a recruitment channel the way a personal encounter does. Those who socialize enough to encounter some recruitment opportunities do volunteer, but their social contexts (often peer-group gatherings without institutional anchoring) may not provide the escalating web of obligations that drove older cohorts toward deeper engagement.</w:t>
       </w:r>
     </w:p>
     <w:p>
@@ -22484,7 +22369,7 @@
           <w:i w:val="0"/>
           <w:sz w:val="24"/>
         </w:rPr>
-        <w:t>The baseline paradox itself admits two interpretations: stronger intrinsic civic motivation cultivated through digital cause-awareness, or compositional differences—an isolated 18-year-old living with volunteering parents differs from an isolated 65-year-old retiree. Our baseline comparison controls for demographics but cannot fully account for unobserved household-level civic socialization. The more consequential finding, regardless, is what happens above the baseline: Gen Z's volunteering probability plateaus where other generations' continues to climb, and it is this ceiling—not the floor—that explains the overall generational gap.</w:t>
+        <w:t>The baseline paradox admits two interpretations: stronger intrinsic civic motivation cultivated through digital cause-awareness, or compositional differences (an isolated 18-year-old living with volunteering parents differs from an isolated 65-year-old retiree). Our baseline comparison controls for demographics but cannot fully account for unobserved household-level civic socialization. The more consequential finding is what happens above the baseline: Gen Z's volunteering probability plateaus where other generations' continues to climb, and it is this ceiling, not the floor, that explains the overall generational gap.</w:t>
       </w:r>
     </w:p>
     <w:p>
@@ -22500,7 +22385,7 @@
           <w:i w:val="0"/>
           <w:sz w:val="24"/>
         </w:rPr>
-        <w:t>At the policy level, the Surgeon General's 2023 advisory focused predominantly on the health consequences of social disconnection. Our results suggest extending that framing to encompass civic consequences as well. Workplace-based volunteer programs may serve a bridging function by providing the structured, organizationally anchored social context that the LPA analysis identified as critical for translating socialization into civic action. Federal and state civic engagement initiatives would benefit from incorporating a "social activation" component that addresses social isolation as a barrier to entry rather than assuming motivation alone is sufficient. The common thread is designing the social encounter first and the volunteer recruitment second—inverting the traditional model that assumes interested individuals will seek out opportunities on their own.</w:t>
+        <w:t>At the policy level, the Surgeon General's 2023 advisory focused predominantly on health consequences of social disconnection. Our results point to civic consequences that deserve equal attention. Workplace-based volunteer programs may serve a bridging function by providing the structured, organizationally anchored social context that the LPA analysis identified as critical for translating socialization into civic action. Federal and state civic engagement initiatives would benefit from incorporating a "social activation" component that addresses social isolation as a barrier to entry rather than assuming motivation alone is sufficient. The common thread is designing the social encounter first and the volunteer ask second, inverting the traditional model that assumes interested individuals will seek out opportunities on their own.</w:t>
       </w:r>
     </w:p>
     <w:p>
@@ -22515,7 +22400,7 @@
           <w:i w:val="0"/>
           <w:sz w:val="24"/>
         </w:rPr>
-        <w:t>Limitations</w:t>
+        <w:t>Limitations and Future Directions</w:t>
       </w:r>
     </w:p>
     <w:p>
@@ -22531,7 +22416,7 @@
           <w:i w:val="0"/>
           <w:sz w:val="24"/>
         </w:rPr>
-        <w:t>Does the gradient reflect socialization causing volunteering, or volunteering generating social contact? The pooled cross-sectional design cannot resolve this. People who volunteer meet others through their service, which increases their socialization frequency; the entire gradient could be partly driven by this reverse pathway—or both socialization and volunteering may reflect a common disposition such as extraversion. Two features of the results provide partial leverage against a purely reverse-causal account. The nonlinear threshold shape of the First Step Effect is more consistent with a recruitment mechanism—in which initial contact triggers awareness of opportunities—than with reverse causation, which would predict a more linear association. And the temporal stability of the pattern across four waves suggests a durable relationship rather than a context-dependent artifact. True panel data or quasi-experimental designs—potentially leveraging the CPS rotation group structure—could more definitively establish directionality.</w:t>
+        <w:t>Does the gradient reflect socialization causing volunteering, or volunteering generating social contact? The pooled cross-sectional design cannot resolve this question. People who volunteer meet others through their service, which increases their socialization frequency; the entire gradient could be partly driven by this reverse pathway, or both socialization and volunteering may reflect a common disposition such as extraversion. Two features of the results provide partial leverage against a purely reverse-causal account. The nonlinear threshold shape of the First Step Effect is more consistent with a recruitment mechanism, in which initial contact triggers awareness of opportunities, than with reverse causation, which would predict a more linear association. And the temporal stability of the pattern across four waves suggests a durable relationship rather than a context-dependent artifact. Establishing directionality will require longitudinal data. The CPS rotation group structure offers a quasi-panel design that could establish whether changes in socialization within individuals precede changes in volunteering; true panel studies (e.g., PSID, Understanding America Study) could provide more definitive evidence. The First Step Effect also implies a specific intervention design: randomized controlled trials of low-threshold, single-contact programs targeting socially isolated young adults would test whether the cross-sectional associations documented here reflect causal pathways.</w:t>
       </w:r>
     </w:p>
     <w:p>
@@ -22547,7 +22432,7 @@
           <w:i w:val="0"/>
           <w:sz w:val="24"/>
         </w:rPr>
-        <w:t xml:space="preserve">Measurement constraints introduce additional caveats. The CESOCIALIZE item captures frequency of socialization but not its quality, depth, or content; "got together socially with friends, relatives, or neighbors" conflates kin-based socialization (primarily bonding capital), friendship networks, and neighbor contact (most directly tied to community recruitment). These domains have different theoretical relationships to volunteering, and the composite measure cannot disentangle them. The binary COVID coding (2017/2019 vs. 2021/2023) is approximate; the 2021 wave was administered during, not after, the pandemic. A supplementary three-period specification (Pre-COVID 2017/2019, During-COVID 2021, Post-COVID 2023) yielded a non-significant three-way interaction (F = 1.04, df = 40, </w:t>
+        <w:t xml:space="preserve">Measurement constraints add further caveats. The CESOCIALIZE item captures frequency of socialization but not its quality, depth, or content; "got together socially with friends, relatives, or neighbors" conflates kin-based socialization (primarily bonding capital), friendship networks, and neighbor contact (most directly tied to community recruitment). These domains have different theoretical relationships to volunteering, and the composite measure cannot disentangle them; future research should disaggregate socialization by context (kin vs. friend vs. neighbor) and institutional setting (organizationally embedded vs. informal) to test whether institutionally anchored socialization is uniquely tied to civic recruitment. The binary COVID coding (2017/2019 vs. 2021/2023) is approximate; the 2021 wave was administered during, not after, the pandemic. A supplementary three-period specification (Pre-COVID 2017/2019, During-COVID 2021, Post-COVID 2023) yielded a non-significant three-way interaction (F = 1.04, df = 40, </w:t>
       </w:r>
       <w:r>
         <w:rPr>
@@ -22565,7 +22450,7 @@
           <w:i w:val="0"/>
           <w:sz w:val="24"/>
         </w:rPr>
-        <w:t xml:space="preserve"> = .396), confirming that the socialization–volunteering–generation relationship was stable across all three periods. The PES16F variable measuring virtual versus in-person volunteering mode is available only for the 2023 wave, preventing systematic analysis of how volunteering modality interacts with social isolation. All measures are self-reported and subject to social desirability bias, which may differentially affect reporting of socially valued behaviors such as volunteering. Generational classification by birth cohort conflates age, period, and cohort effects. Supplementary analyses—nonlinear age controls (age-squared), fixed age-band comparisons (ages 25–30 across waves), and shifted generation boundaries (Gen Z = 1995+)—confirmed that the socialization-by-generation interaction survived all specifications (</w:t>
+        <w:t xml:space="preserve"> = .396), confirming that the socialization–volunteering–generation relationship was stable across all three periods. The PES16F variable measuring virtual versus in-person volunteering mode is available only for the 2023 wave, preventing systematic analysis of how volunteering modality interacts with social isolation. All measures are self-reported and subject to social desirability bias, which may differentially affect reporting of socially valued behaviors such as volunteering. Generational classification by birth cohort conflates age, period, and cohort effects. Supplementary analyses (nonlinear age controls [age-squared], fixed age-band comparisons [ages 25–30 across waves], and shifted generation boundaries [Gen Z = 1995+]) confirmed that the socialization-by-generation interaction survived all specifications (</w:t>
       </w:r>
       <w:r>
         <w:rPr>
@@ -22583,38 +22468,7 @@
           <w:i w:val="0"/>
           <w:sz w:val="24"/>
         </w:rPr>
-        <w:t xml:space="preserve"> &lt; .001) and that First Step AMEs were essentially unchanged. These tests reduce the plausibility of a purely age-based account without eliminating it; we cannot rule out that what we attribute to generational differences reflects life-stage effects that would dissipate as Gen Z ages into the institutional roles that historically anchor civic participation. The interpretation of "generation" in this study should be understood as birth-cohort-at-observed-age rather than as a fixed generational identity, and a formal age-period-cohort decomposition would require additional data waves. The CPS-CEV does not include a religious attendance item—a notable omission given that congregations are among the strongest institutional predictors of volunteering in U.S. studies (Putnam &amp; Campbell, 2010; Musick &amp; Wilson, 2008). Organizational membership count and charitable donation to religious organizations provide partial proxies, and the robustness analysis showing ~30% attenuation of the First Step Effect when controlling for membership suggests the socialization pathway partly operates through institutional channels, of which religious congregations are a major component. The dependent variable captures extensive-margin participation (volunteered yes/no in past 12 months) but not intensive-margin engagement; the CPS Volunteer Supplement includes annual volunteer hours (VLHALLORG), which could serve as a continuous alternative in future analyses.</w:t>
-      </w:r>
-    </w:p>
-    <w:p>
-      <w:pPr>
-        <w:spacing w:before="0" w:after="0" w:lineRule="auto" w:line="480"/>
-        <w:jc w:val="left"/>
-      </w:pPr>
-      <w:r>
-        <w:rPr>
-          <w:rFonts w:ascii="Times New Roman" w:hAnsi="Times New Roman" w:cs="Times New Roman"/>
-          <w:b/>
-          <w:i w:val="0"/>
-          <w:sz w:val="24"/>
-        </w:rPr>
-        <w:t>Future Directions</w:t>
-      </w:r>
-    </w:p>
-    <w:p>
-      <w:pPr>
-        <w:spacing w:before="0" w:after="0" w:lineRule="auto" w:line="480"/>
-        <w:ind w:firstLine="720"/>
-        <w:jc w:val="left"/>
-      </w:pPr>
-      <w:r>
-        <w:rPr>
-          <w:rFonts w:ascii="Times New Roman" w:hAnsi="Times New Roman" w:cs="Times New Roman"/>
-          <w:b w:val="0"/>
-          <w:i w:val="0"/>
-          <w:sz w:val="24"/>
-        </w:rPr>
-        <w:t>These limitations point toward three productive lines of inquiry. The causal question demands longitudinal data. The CPS rotation group structure offers a quasi-panel design that could establish whether changes in socialization within individuals precede changes in volunteering; true panel studies (e.g., PSID, Understanding America Study) could provide more definitive evidence. The CESOCIALIZE measure's breadth also obscures important distinctions; future research should disaggregate socialization by context (kin vs. friend vs. neighbor) and institutional setting (organizationally embedded vs. informal) to test whether institutionally anchored socialization is uniquely associated with civic recruitment. Finally, the First Step Effect implies a specific intervention design: randomized controlled trials of low-threshold, single-contact programs targeting socially isolated young adults would test whether the cross-sectional associations documented here reflect causal pathways.</w:t>
+        <w:t xml:space="preserve"> &lt; .001) and that First Step AMEs were essentially unchanged. Such tests reduce the plausibility of a purely age-based account without eliminating it; we cannot rule out that what we attribute to generational differences reflects life-stage effects that would dissipate as Gen Z ages into the institutional roles that historically anchor civic participation. We use "generation" to mean birth-cohort-at-observed-age rather than a fixed generational identity; a formal age-period-cohort decomposition would require additional data waves. The CPS-CEV does not include a religious attendance item, a notable omission given that congregations are among the strongest institutional predictors of volunteering in U.S. studies (Putnam &amp; Campbell, 2010; Musick &amp; Wilson, 2008). Organizational membership count and charitable donation to religious organizations provide partial proxies, and the robustness analysis showing ~30% attenuation of the First Step Effect when controlling for membership suggests the socialization pathway partly operates through institutional channels, of which religious congregations are a major component. The dependent variable captures extensive-margin participation (volunteered yes/no in past 12 months) but not intensive-margin engagement; the CPS Volunteer Supplement includes annual volunteer hours (VLHALLORG), which could serve as a continuous alternative in future analyses.</w:t>
       </w:r>
     </w:p>
     <w:p>
@@ -22645,7 +22499,7 @@
           <w:i w:val="0"/>
           <w:sz w:val="24"/>
         </w:rPr>
-        <w:t>The social disconnection of Generation Z is a civic engagement challenge as much as a health challenge. What the data show, with consistent convergence across methods and time, is that one step out of isolation is associated with a larger civic return than any subsequent increase in social frequency. In 2000, Americans were bowling alone; a quarter century later, the youngest Americans are scrolling together—maintaining the appearance of social connection through digital platforms that sustain awareness of community needs without providing the face-to-face encounters that translate awareness into action. The path to volunteering begins not with appeals to duty or digital campaigns, but with creating the physical social encounters—the social infrastructure (Klinenberg, 2018)—that make civic recruitment possible.</w:t>
+        <w:t>The social disconnection of Generation Z is a civic engagement challenge as much as a health challenge. What the data show, with consistent convergence across methods and across time, is that one step out of isolation is associated with a larger civic return than any subsequent increase in social frequency. In 2000, Americans were bowling alone; a quarter century later, the youngest Americans are scrolling together, maintaining the appearance of social connection through digital platforms that sustain awareness of community needs without providing the face-to-face encounters that translate awareness into action. The path to volunteering begins not with appeals to duty or digital campaigns but with creating the physical social encounters, the social infrastructure that Klinenberg (2018) describes, that make civic recruitment possible.</w:t>
       </w:r>
     </w:p>
     <w:p>

</xml_diff>

<commit_message>
Remove all em dashes from build script and rebuild DOCX
Replace 55 em dash instances (5 literal + 50 escaped \u2014) in
build_docx.py with commas or hyphens. Rebuild DOCX to reflect
zero em dashes across all manuscript content and references.

Co-Authored-By: Claude Opus 4.6 (1M context) <noreply@anthropic.com>
</commit_message>
<xml_diff>
--- a/paper/Bowling_Alone_CLEAN.docx
+++ b/paper/Bowling_Alone_CLEAN.docx
@@ -22731,7 +22731,7 @@
           <w:i/>
           <w:sz w:val="24"/>
         </w:rPr>
-        <w:t>Volunteering in the United States—2015</w:t>
+        <w:t>Volunteering in the United States, 2015</w:t>
       </w:r>
       <w:r>
         <w:rPr>
@@ -23887,7 +23887,7 @@
           <w:i/>
           <w:sz w:val="24"/>
         </w:rPr>
-        <w:t>iGen: Why today’s super-connected kids are growing up less rebellious, more tolerant, less happy—and completely unprepared for adulthood</w:t>
+        <w:t>iGen: Why today’s super-connected kids are growing up less rebellious, more tolerant, less happy, and completely unprepared for adulthood</w:t>
       </w:r>
       <w:r>
         <w:rPr>

</xml_diff>